<commit_message>
Updated DB creation script and user manual
</commit_message>
<xml_diff>
--- a/Ticketing-Screen-Designer User Manual.docx
+++ b/Ticketing-Screen-Designer User Manual.docx
@@ -1091,13 +1091,20 @@
       <w:proofErr w:type="spellStart"/>
       <w:r>
         <w:rPr>
-          <w:rStyle w:val="HTMLCode"/>
-        </w:rPr>
-        <w:t>connectionString</w:t>
+          <w:rFonts w:ascii="Cascadia Mono" w:hAnsi="Cascadia Mono" w:cs="Cascadia Mono"/>
+          <w:color w:val="2E75B6"/>
+          <w:sz w:val="19"/>
+          <w:szCs w:val="19"/>
+          <w:highlight w:val="white"/>
+        </w:rPr>
+        <w:t>DbConnection</w:t>
       </w:r>
       <w:proofErr w:type="spellEnd"/>
       <w:r>
-        <w:t xml:space="preserve"> attribute based on your SQL Server authentication method:</w:t>
+        <w:t xml:space="preserve"> </w:t>
+      </w:r>
+      <w:r>
+        <w:t>attribute based on your SQL Server authentication method:</w:t>
       </w:r>
     </w:p>
     <w:p>
@@ -1116,7 +1123,12 @@
         <w:t>If you are using Windows Authentication (Recommended):</w:t>
       </w:r>
       <w:r>
-        <w:t xml:space="preserve"> This method uses your Windows login credentials to authenticate with SQL Server.</w:t>
+        <w:t xml:space="preserve"> This method uses your Windows login credentials to authenticate with SQL Serve</w:t>
+      </w:r>
+      <w:bookmarkStart w:id="0" w:name="_GoBack"/>
+      <w:bookmarkEnd w:id="0"/>
+      <w:r>
+        <w:t>r.</w:t>
       </w:r>
     </w:p>
     <w:p>
@@ -1556,7 +1568,219 @@
           <w:szCs w:val="19"/>
           <w:highlight w:val="white"/>
         </w:rPr>
-        <w:t>Integrated Security=Tru</w:t>
+        <w:t xml:space="preserve">Integrated Security=True </w:t>
+      </w:r>
+      <w:r>
+        <w:rPr>
+          <w:b/>
+          <w:bCs/>
+        </w:rPr>
+        <w:t>if Windows Authentication is used.</w:t>
+      </w:r>
+    </w:p>
+    <w:p>
+      <w:pPr>
+        <w:pStyle w:val="NormalWeb"/>
+        <w:ind w:left="1440"/>
+        <w:rPr>
+          <w:b/>
+          <w:bCs/>
+        </w:rPr>
+      </w:pPr>
+      <w:r>
+        <w:rPr>
+          <w:b/>
+          <w:bCs/>
+        </w:rPr>
+        <w:t xml:space="preserve">We use </w:t>
+      </w:r>
+      <w:proofErr w:type="spellStart"/>
+      <w:r>
+        <w:rPr>
+          <w:b/>
+          <w:bCs/>
+        </w:rPr>
+        <w:t>TrustServerCertificate</w:t>
+      </w:r>
+      <w:proofErr w:type="spellEnd"/>
+      <w:r>
+        <w:rPr>
+          <w:b/>
+          <w:bCs/>
+        </w:rPr>
+        <w:t>=true;</w:t>
+      </w:r>
+      <w:r>
+        <w:rPr>
+          <w:b/>
+          <w:bCs/>
+        </w:rPr>
+        <w:t xml:space="preserve"> only if no certificate is used, to bypass encryption.</w:t>
+      </w:r>
+    </w:p>
+    <w:p>
+      <w:pPr>
+        <w:pStyle w:val="NormalWeb"/>
+        <w:numPr>
+          <w:ilvl w:val="1"/>
+          <w:numId w:val="21"/>
+        </w:numPr>
+      </w:pPr>
+      <w:r>
+        <w:rPr>
+          <w:b/>
+          <w:bCs/>
+        </w:rPr>
+        <w:t>If you are using SQL Server Authentication:</w:t>
+      </w:r>
+      <w:r>
+        <w:t xml:space="preserve"> This method requires a specific SQL Server username and password.</w:t>
+      </w:r>
+    </w:p>
+    <w:p>
+      <w:pPr>
+        <w:spacing w:beforeAutospacing="1" w:afterAutospacing="1"/>
+        <w:ind w:left="1440"/>
+      </w:pPr>
+      <w:r>
+        <w:rPr>
+          <w:rStyle w:val="ng-tns-c2996937847-33"/>
+        </w:rPr>
+        <w:t>Json:</w:t>
+      </w:r>
+    </w:p>
+    <w:p>
+      <w:pPr>
+        <w:autoSpaceDE w:val="0"/>
+        <w:autoSpaceDN w:val="0"/>
+        <w:adjustRightInd w:val="0"/>
+        <w:spacing w:after="0" w:line="240" w:lineRule="auto"/>
+        <w:rPr>
+          <w:rFonts w:ascii="Cascadia Mono" w:hAnsi="Cascadia Mono" w:cs="Cascadia Mono"/>
+          <w:color w:val="000000"/>
+          <w:sz w:val="19"/>
+          <w:szCs w:val="19"/>
+          <w:highlight w:val="white"/>
+        </w:rPr>
+      </w:pPr>
+      <w:r>
+        <w:rPr>
+          <w:rFonts w:ascii="Cascadia Mono" w:hAnsi="Cascadia Mono" w:cs="Cascadia Mono"/>
+          <w:color w:val="000000"/>
+          <w:sz w:val="19"/>
+          <w:szCs w:val="19"/>
+          <w:highlight w:val="white"/>
+        </w:rPr>
+        <w:t xml:space="preserve">  </w:t>
+      </w:r>
+      <w:r>
+        <w:rPr>
+          <w:rFonts w:ascii="Cascadia Mono" w:hAnsi="Cascadia Mono" w:cs="Cascadia Mono"/>
+          <w:color w:val="2E75B6"/>
+          <w:sz w:val="19"/>
+          <w:szCs w:val="19"/>
+          <w:highlight w:val="white"/>
+        </w:rPr>
+        <w:t>"</w:t>
+      </w:r>
+      <w:proofErr w:type="spellStart"/>
+      <w:r>
+        <w:rPr>
+          <w:rFonts w:ascii="Cascadia Mono" w:hAnsi="Cascadia Mono" w:cs="Cascadia Mono"/>
+          <w:color w:val="2E75B6"/>
+          <w:sz w:val="19"/>
+          <w:szCs w:val="19"/>
+          <w:highlight w:val="white"/>
+        </w:rPr>
+        <w:t>ConnectionStrings</w:t>
+      </w:r>
+      <w:proofErr w:type="spellEnd"/>
+      <w:r>
+        <w:rPr>
+          <w:rFonts w:ascii="Cascadia Mono" w:hAnsi="Cascadia Mono" w:cs="Cascadia Mono"/>
+          <w:color w:val="2E75B6"/>
+          <w:sz w:val="19"/>
+          <w:szCs w:val="19"/>
+          <w:highlight w:val="white"/>
+        </w:rPr>
+        <w:t>"</w:t>
+      </w:r>
+      <w:r>
+        <w:rPr>
+          <w:rFonts w:ascii="Cascadia Mono" w:hAnsi="Cascadia Mono" w:cs="Cascadia Mono"/>
+          <w:color w:val="000000"/>
+          <w:sz w:val="19"/>
+          <w:szCs w:val="19"/>
+          <w:highlight w:val="white"/>
+        </w:rPr>
+        <w:t>: {</w:t>
+      </w:r>
+    </w:p>
+    <w:p>
+      <w:pPr>
+        <w:autoSpaceDE w:val="0"/>
+        <w:autoSpaceDN w:val="0"/>
+        <w:adjustRightInd w:val="0"/>
+        <w:spacing w:after="0" w:line="240" w:lineRule="auto"/>
+        <w:rPr>
+          <w:rFonts w:ascii="Cascadia Mono" w:hAnsi="Cascadia Mono" w:cs="Cascadia Mono"/>
+          <w:color w:val="000000"/>
+          <w:sz w:val="19"/>
+          <w:szCs w:val="19"/>
+          <w:highlight w:val="white"/>
+        </w:rPr>
+      </w:pPr>
+      <w:r>
+        <w:rPr>
+          <w:rFonts w:ascii="Cascadia Mono" w:hAnsi="Cascadia Mono" w:cs="Cascadia Mono"/>
+          <w:color w:val="000000"/>
+          <w:sz w:val="19"/>
+          <w:szCs w:val="19"/>
+          <w:highlight w:val="white"/>
+        </w:rPr>
+        <w:t xml:space="preserve">    </w:t>
+      </w:r>
+      <w:r>
+        <w:rPr>
+          <w:rFonts w:ascii="Cascadia Mono" w:hAnsi="Cascadia Mono" w:cs="Cascadia Mono"/>
+          <w:color w:val="2E75B6"/>
+          <w:sz w:val="19"/>
+          <w:szCs w:val="19"/>
+          <w:highlight w:val="white"/>
+        </w:rPr>
+        <w:t>"</w:t>
+      </w:r>
+      <w:proofErr w:type="spellStart"/>
+      <w:r>
+        <w:rPr>
+          <w:rFonts w:ascii="Cascadia Mono" w:hAnsi="Cascadia Mono" w:cs="Cascadia Mono"/>
+          <w:color w:val="2E75B6"/>
+          <w:sz w:val="19"/>
+          <w:szCs w:val="19"/>
+          <w:highlight w:val="white"/>
+        </w:rPr>
+        <w:t>DbConnection</w:t>
+      </w:r>
+      <w:proofErr w:type="spellEnd"/>
+      <w:r>
+        <w:rPr>
+          <w:rFonts w:ascii="Cascadia Mono" w:hAnsi="Cascadia Mono" w:cs="Cascadia Mono"/>
+          <w:color w:val="2E75B6"/>
+          <w:sz w:val="19"/>
+          <w:szCs w:val="19"/>
+          <w:highlight w:val="white"/>
+        </w:rPr>
+        <w:t>"</w:t>
+      </w:r>
+      <w:r>
+        <w:rPr>
+          <w:rFonts w:ascii="Cascadia Mono" w:hAnsi="Cascadia Mono" w:cs="Cascadia Mono"/>
+          <w:color w:val="000000"/>
+          <w:sz w:val="19"/>
+          <w:szCs w:val="19"/>
+          <w:highlight w:val="white"/>
+        </w:rPr>
+        <w:t xml:space="preserve">: </w:t>
       </w:r>
       <w:r>
         <w:rPr>
@@ -1566,220 +1790,9 @@
           <w:szCs w:val="19"/>
           <w:highlight w:val="white"/>
         </w:rPr>
-        <w:t xml:space="preserve">e </w:t>
-      </w:r>
-      <w:r>
-        <w:rPr>
-          <w:b/>
-          <w:bCs/>
-        </w:rPr>
-        <w:t>if Windows Authentication is used.</w:t>
-      </w:r>
-    </w:p>
-    <w:p>
-      <w:pPr>
-        <w:pStyle w:val="NormalWeb"/>
-        <w:ind w:left="1440"/>
-        <w:rPr>
-          <w:b/>
-          <w:bCs/>
-        </w:rPr>
-      </w:pPr>
-      <w:r>
-        <w:rPr>
-          <w:b/>
-          <w:bCs/>
-        </w:rPr>
-        <w:t xml:space="preserve">We use </w:t>
+        <w:t>"Server=</w:t>
       </w:r>
       <w:proofErr w:type="spellStart"/>
-      <w:r>
-        <w:rPr>
-          <w:b/>
-          <w:bCs/>
-        </w:rPr>
-        <w:t>TrustServerCertificate</w:t>
-      </w:r>
-      <w:proofErr w:type="spellEnd"/>
-      <w:r>
-        <w:rPr>
-          <w:b/>
-          <w:bCs/>
-        </w:rPr>
-        <w:t>=true;</w:t>
-      </w:r>
-      <w:r>
-        <w:rPr>
-          <w:b/>
-          <w:bCs/>
-        </w:rPr>
-        <w:t xml:space="preserve"> only if no certificate is used, to bypass encryption.</w:t>
-      </w:r>
-    </w:p>
-    <w:p>
-      <w:pPr>
-        <w:pStyle w:val="NormalWeb"/>
-        <w:numPr>
-          <w:ilvl w:val="1"/>
-          <w:numId w:val="21"/>
-        </w:numPr>
-      </w:pPr>
-      <w:r>
-        <w:rPr>
-          <w:b/>
-          <w:bCs/>
-        </w:rPr>
-        <w:t>If you are using SQL Server Authentication:</w:t>
-      </w:r>
-      <w:r>
-        <w:t xml:space="preserve"> This method requires a specific SQL Server username and password.</w:t>
-      </w:r>
-    </w:p>
-    <w:p>
-      <w:pPr>
-        <w:spacing w:beforeAutospacing="1" w:afterAutospacing="1"/>
-        <w:ind w:left="1440"/>
-      </w:pPr>
-      <w:r>
-        <w:rPr>
-          <w:rStyle w:val="ng-tns-c2996937847-33"/>
-        </w:rPr>
-        <w:t>Json:</w:t>
-      </w:r>
-    </w:p>
-    <w:p>
-      <w:pPr>
-        <w:autoSpaceDE w:val="0"/>
-        <w:autoSpaceDN w:val="0"/>
-        <w:adjustRightInd w:val="0"/>
-        <w:spacing w:after="0" w:line="240" w:lineRule="auto"/>
-        <w:rPr>
-          <w:rFonts w:ascii="Cascadia Mono" w:hAnsi="Cascadia Mono" w:cs="Cascadia Mono"/>
-          <w:color w:val="000000"/>
-          <w:sz w:val="19"/>
-          <w:szCs w:val="19"/>
-          <w:highlight w:val="white"/>
-        </w:rPr>
-      </w:pPr>
-      <w:r>
-        <w:rPr>
-          <w:rFonts w:ascii="Cascadia Mono" w:hAnsi="Cascadia Mono" w:cs="Cascadia Mono"/>
-          <w:color w:val="000000"/>
-          <w:sz w:val="19"/>
-          <w:szCs w:val="19"/>
-          <w:highlight w:val="white"/>
-        </w:rPr>
-        <w:t xml:space="preserve">  </w:t>
-      </w:r>
-      <w:r>
-        <w:rPr>
-          <w:rFonts w:ascii="Cascadia Mono" w:hAnsi="Cascadia Mono" w:cs="Cascadia Mono"/>
-          <w:color w:val="2E75B6"/>
-          <w:sz w:val="19"/>
-          <w:szCs w:val="19"/>
-          <w:highlight w:val="white"/>
-        </w:rPr>
-        <w:t>"</w:t>
-      </w:r>
-      <w:proofErr w:type="spellStart"/>
-      <w:r>
-        <w:rPr>
-          <w:rFonts w:ascii="Cascadia Mono" w:hAnsi="Cascadia Mono" w:cs="Cascadia Mono"/>
-          <w:color w:val="2E75B6"/>
-          <w:sz w:val="19"/>
-          <w:szCs w:val="19"/>
-          <w:highlight w:val="white"/>
-        </w:rPr>
-        <w:t>ConnectionStrings</w:t>
-      </w:r>
-      <w:proofErr w:type="spellEnd"/>
-      <w:r>
-        <w:rPr>
-          <w:rFonts w:ascii="Cascadia Mono" w:hAnsi="Cascadia Mono" w:cs="Cascadia Mono"/>
-          <w:color w:val="2E75B6"/>
-          <w:sz w:val="19"/>
-          <w:szCs w:val="19"/>
-          <w:highlight w:val="white"/>
-        </w:rPr>
-        <w:t>"</w:t>
-      </w:r>
-      <w:r>
-        <w:rPr>
-          <w:rFonts w:ascii="Cascadia Mono" w:hAnsi="Cascadia Mono" w:cs="Cascadia Mono"/>
-          <w:color w:val="000000"/>
-          <w:sz w:val="19"/>
-          <w:szCs w:val="19"/>
-          <w:highlight w:val="white"/>
-        </w:rPr>
-        <w:t>: {</w:t>
-      </w:r>
-    </w:p>
-    <w:p>
-      <w:pPr>
-        <w:autoSpaceDE w:val="0"/>
-        <w:autoSpaceDN w:val="0"/>
-        <w:adjustRightInd w:val="0"/>
-        <w:spacing w:after="0" w:line="240" w:lineRule="auto"/>
-        <w:rPr>
-          <w:rFonts w:ascii="Cascadia Mono" w:hAnsi="Cascadia Mono" w:cs="Cascadia Mono"/>
-          <w:color w:val="000000"/>
-          <w:sz w:val="19"/>
-          <w:szCs w:val="19"/>
-          <w:highlight w:val="white"/>
-        </w:rPr>
-      </w:pPr>
-      <w:r>
-        <w:rPr>
-          <w:rFonts w:ascii="Cascadia Mono" w:hAnsi="Cascadia Mono" w:cs="Cascadia Mono"/>
-          <w:color w:val="000000"/>
-          <w:sz w:val="19"/>
-          <w:szCs w:val="19"/>
-          <w:highlight w:val="white"/>
-        </w:rPr>
-        <w:t xml:space="preserve">    </w:t>
-      </w:r>
-      <w:r>
-        <w:rPr>
-          <w:rFonts w:ascii="Cascadia Mono" w:hAnsi="Cascadia Mono" w:cs="Cascadia Mono"/>
-          <w:color w:val="2E75B6"/>
-          <w:sz w:val="19"/>
-          <w:szCs w:val="19"/>
-          <w:highlight w:val="white"/>
-        </w:rPr>
-        <w:t>"</w:t>
-      </w:r>
-      <w:proofErr w:type="spellStart"/>
-      <w:r>
-        <w:rPr>
-          <w:rFonts w:ascii="Cascadia Mono" w:hAnsi="Cascadia Mono" w:cs="Cascadia Mono"/>
-          <w:color w:val="2E75B6"/>
-          <w:sz w:val="19"/>
-          <w:szCs w:val="19"/>
-          <w:highlight w:val="white"/>
-        </w:rPr>
-        <w:t>DbConnection</w:t>
-      </w:r>
-      <w:proofErr w:type="spellEnd"/>
-      <w:r>
-        <w:rPr>
-          <w:rFonts w:ascii="Cascadia Mono" w:hAnsi="Cascadia Mono" w:cs="Cascadia Mono"/>
-          <w:color w:val="2E75B6"/>
-          <w:sz w:val="19"/>
-          <w:szCs w:val="19"/>
-          <w:highlight w:val="white"/>
-        </w:rPr>
-        <w:t>"</w:t>
-      </w:r>
-      <w:r>
-        <w:rPr>
-          <w:rFonts w:ascii="Cascadia Mono" w:hAnsi="Cascadia Mono" w:cs="Cascadia Mono"/>
-          <w:color w:val="000000"/>
-          <w:sz w:val="19"/>
-          <w:szCs w:val="19"/>
-          <w:highlight w:val="white"/>
-        </w:rPr>
-        <w:t xml:space="preserve">: </w:t>
-      </w:r>
       <w:r>
         <w:rPr>
           <w:rFonts w:ascii="Cascadia Mono" w:hAnsi="Cascadia Mono" w:cs="Cascadia Mono"/>
@@ -1788,9 +1801,9 @@
           <w:szCs w:val="19"/>
           <w:highlight w:val="white"/>
         </w:rPr>
-        <w:t>"Server=</w:t>
-      </w:r>
-      <w:proofErr w:type="spellStart"/>
+        <w:t>YOUR-SERVER-</w:t>
+      </w:r>
+      <w:proofErr w:type="gramStart"/>
       <w:r>
         <w:rPr>
           <w:rFonts w:ascii="Cascadia Mono" w:hAnsi="Cascadia Mono" w:cs="Cascadia Mono"/>
@@ -1799,9 +1812,10 @@
           <w:szCs w:val="19"/>
           <w:highlight w:val="white"/>
         </w:rPr>
-        <w:t>YOUR-SERVER-</w:t>
-      </w:r>
-      <w:proofErr w:type="gramStart"/>
+        <w:t>NAME;Database</w:t>
+      </w:r>
+      <w:proofErr w:type="spellEnd"/>
+      <w:proofErr w:type="gramEnd"/>
       <w:r>
         <w:rPr>
           <w:rFonts w:ascii="Cascadia Mono" w:hAnsi="Cascadia Mono" w:cs="Cascadia Mono"/>
@@ -1810,10 +1824,9 @@
           <w:szCs w:val="19"/>
           <w:highlight w:val="white"/>
         </w:rPr>
-        <w:t>NAME;Database</w:t>
-      </w:r>
-      <w:proofErr w:type="spellEnd"/>
-      <w:proofErr w:type="gramEnd"/>
+        <w:t>=</w:t>
+      </w:r>
+      <w:proofErr w:type="spellStart"/>
       <w:r>
         <w:rPr>
           <w:rFonts w:ascii="Cascadia Mono" w:hAnsi="Cascadia Mono" w:cs="Cascadia Mono"/>
@@ -1822,28 +1835,7 @@
           <w:szCs w:val="19"/>
           <w:highlight w:val="white"/>
         </w:rPr>
-        <w:t>=</w:t>
-      </w:r>
-      <w:proofErr w:type="spellStart"/>
-      <w:r>
-        <w:rPr>
-          <w:rFonts w:ascii="Cascadia Mono" w:hAnsi="Cascadia Mono" w:cs="Cascadia Mono"/>
-          <w:color w:val="A31515"/>
-          <w:sz w:val="19"/>
-          <w:szCs w:val="19"/>
-          <w:highlight w:val="white"/>
-        </w:rPr>
-        <w:t>YOUR-DATABASE-NAME</w:t>
-      </w:r>
-      <w:r>
-        <w:rPr>
-          <w:rFonts w:ascii="Cascadia Mono" w:hAnsi="Cascadia Mono" w:cs="Cascadia Mono"/>
-          <w:color w:val="A31515"/>
-          <w:sz w:val="19"/>
-          <w:szCs w:val="19"/>
-          <w:highlight w:val="white"/>
-        </w:rPr>
-        <w:t>;</w:t>
+        <w:t>YOUR-DATABASE-NAME;</w:t>
       </w:r>
       <w:r>
         <w:rPr>
@@ -3391,27 +3383,14 @@
       <w:r>
         <w:t xml:space="preserve">Figure </w:t>
       </w:r>
-      <w:r>
-        <w:fldChar w:fldCharType="begin"/>
-      </w:r>
-      <w:r>
-        <w:instrText xml:space="preserve"> SEQ Figure \* ARABIC </w:instrText>
-      </w:r>
-      <w:r>
-        <w:fldChar w:fldCharType="separate"/>
-      </w:r>
-      <w:r>
-        <w:rPr>
-          <w:noProof/>
-        </w:rPr>
-        <w:t>1</w:t>
-      </w:r>
-      <w:r>
-        <w:rPr>
-          <w:noProof/>
-        </w:rPr>
-        <w:fldChar w:fldCharType="end"/>
-      </w:r>
+      <w:fldSimple w:instr=" SEQ Figure \* ARABIC ">
+        <w:r>
+          <w:rPr>
+            <w:noProof/>
+          </w:rPr>
+          <w:t>1</w:t>
+        </w:r>
+      </w:fldSimple>
       <w:r>
         <w:t xml:space="preserve"> Bank Form </w:t>
       </w:r>
@@ -4300,27 +4279,14 @@
       <w:r>
         <w:t xml:space="preserve">Figure </w:t>
       </w:r>
-      <w:r>
-        <w:fldChar w:fldCharType="begin"/>
-      </w:r>
-      <w:r>
-        <w:instrText xml:space="preserve"> SEQ Figure \* ARABIC </w:instrText>
-      </w:r>
-      <w:r>
-        <w:fldChar w:fldCharType="separate"/>
-      </w:r>
-      <w:r>
-        <w:rPr>
-          <w:noProof/>
-        </w:rPr>
-        <w:t>2</w:t>
-      </w:r>
-      <w:r>
-        <w:rPr>
-          <w:noProof/>
-        </w:rPr>
-        <w:fldChar w:fldCharType="end"/>
-      </w:r>
+      <w:fldSimple w:instr=" SEQ Figure \* ARABIC ">
+        <w:r>
+          <w:rPr>
+            <w:noProof/>
+          </w:rPr>
+          <w:t>2</w:t>
+        </w:r>
+      </w:fldSimple>
       <w:r>
         <w:t xml:space="preserve"> Main Form</w:t>
       </w:r>
@@ -4422,27 +4388,14 @@
       <w:r>
         <w:t xml:space="preserve">Figure </w:t>
       </w:r>
-      <w:r>
-        <w:fldChar w:fldCharType="begin"/>
-      </w:r>
-      <w:r>
-        <w:instrText xml:space="preserve"> SEQ Figure \* ARABIC </w:instrText>
-      </w:r>
-      <w:r>
-        <w:fldChar w:fldCharType="separate"/>
-      </w:r>
-      <w:r>
-        <w:rPr>
-          <w:noProof/>
-        </w:rPr>
-        <w:t>3</w:t>
-      </w:r>
-      <w:r>
-        <w:rPr>
-          <w:noProof/>
-        </w:rPr>
-        <w:fldChar w:fldCharType="end"/>
-      </w:r>
+      <w:fldSimple w:instr=" SEQ Figure \* ARABIC ">
+        <w:r>
+          <w:rPr>
+            <w:noProof/>
+          </w:rPr>
+          <w:t>3</w:t>
+        </w:r>
+      </w:fldSimple>
       <w:r>
         <w:t xml:space="preserve"> Highlighted Screen</w:t>
       </w:r>
@@ -5296,27 +5249,14 @@
       <w:r>
         <w:t xml:space="preserve">Figure </w:t>
       </w:r>
-      <w:r>
-        <w:fldChar w:fldCharType="begin"/>
-      </w:r>
-      <w:r>
-        <w:instrText xml:space="preserve"> SEQ Figure \* ARABIC </w:instrText>
-      </w:r>
-      <w:r>
-        <w:fldChar w:fldCharType="separate"/>
-      </w:r>
-      <w:r>
-        <w:rPr>
-          <w:noProof/>
-        </w:rPr>
-        <w:t>4</w:t>
-      </w:r>
-      <w:r>
-        <w:rPr>
-          <w:noProof/>
-        </w:rPr>
-        <w:fldChar w:fldCharType="end"/>
-      </w:r>
+      <w:fldSimple w:instr=" SEQ Figure \* ARABIC ">
+        <w:r>
+          <w:rPr>
+            <w:noProof/>
+          </w:rPr>
+          <w:t>4</w:t>
+        </w:r>
+      </w:fldSimple>
       <w:r>
         <w:t xml:space="preserve"> Add Screen Form</w:t>
       </w:r>
@@ -5953,6 +5893,9 @@
         <w:t xml:space="preserve"> </w:t>
       </w:r>
       <w:r>
+        <w:rPr>
+          <w:noProof/>
+        </w:rPr>
         <w:drawing>
           <wp:inline distT="0" distB="0" distL="0" distR="0" wp14:anchorId="75BA261A" wp14:editId="57DF83A4">
             <wp:extent cx="5943600" cy="3789045"/>
@@ -6005,27 +5948,14 @@
       <w:r>
         <w:t xml:space="preserve">Figure </w:t>
       </w:r>
-      <w:r>
-        <w:fldChar w:fldCharType="begin"/>
-      </w:r>
-      <w:r>
-        <w:instrText xml:space="preserve"> SEQ Figure \* ARABIC </w:instrText>
-      </w:r>
-      <w:r>
-        <w:fldChar w:fldCharType="separate"/>
-      </w:r>
-      <w:r>
-        <w:rPr>
-          <w:noProof/>
-        </w:rPr>
-        <w:t>5</w:t>
-      </w:r>
-      <w:r>
-        <w:rPr>
-          <w:noProof/>
-        </w:rPr>
-        <w:fldChar w:fldCharType="end"/>
-      </w:r>
+      <w:fldSimple w:instr=" SEQ Figure \* ARABIC ">
+        <w:r>
+          <w:rPr>
+            <w:noProof/>
+          </w:rPr>
+          <w:t>5</w:t>
+        </w:r>
+      </w:fldSimple>
       <w:r>
         <w:t xml:space="preserve"> Edit Screen Form</w:t>
       </w:r>
@@ -6102,8 +6032,6 @@
         </w:rPr>
         <w:t>English Button name | Arabic Button Name | Button Type</w:t>
       </w:r>
-      <w:bookmarkStart w:id="0" w:name="_GoBack"/>
-      <w:bookmarkEnd w:id="0"/>
     </w:p>
     <w:p>
       <w:pPr>
@@ -6434,27 +6362,14 @@
       <w:r>
         <w:t xml:space="preserve">Figure </w:t>
       </w:r>
-      <w:r>
-        <w:fldChar w:fldCharType="begin"/>
-      </w:r>
-      <w:r>
-        <w:instrText xml:space="preserve"> SEQ Figure \* ARABIC </w:instrText>
-      </w:r>
-      <w:r>
-        <w:fldChar w:fldCharType="separate"/>
-      </w:r>
-      <w:r>
-        <w:rPr>
-          <w:noProof/>
-        </w:rPr>
-        <w:t>6</w:t>
-      </w:r>
-      <w:r>
-        <w:rPr>
-          <w:noProof/>
-        </w:rPr>
-        <w:fldChar w:fldCharType="end"/>
-      </w:r>
+      <w:fldSimple w:instr=" SEQ Figure \* ARABIC ">
+        <w:r>
+          <w:rPr>
+            <w:noProof/>
+          </w:rPr>
+          <w:t>6</w:t>
+        </w:r>
+      </w:fldSimple>
       <w:r>
         <w:t xml:space="preserve"> Add Button Form</w:t>
       </w:r>
@@ -6577,27 +6492,14 @@
                             <w:r>
                               <w:t xml:space="preserve">Figure </w:t>
                             </w:r>
-                            <w:r>
-                              <w:fldChar w:fldCharType="begin"/>
-                            </w:r>
-                            <w:r>
-                              <w:instrText xml:space="preserve"> SEQ Figure \* ARABIC </w:instrText>
-                            </w:r>
-                            <w:r>
-                              <w:fldChar w:fldCharType="separate"/>
-                            </w:r>
-                            <w:r>
-                              <w:rPr>
-                                <w:noProof/>
-                              </w:rPr>
-                              <w:t>7</w:t>
-                            </w:r>
-                            <w:r>
-                              <w:rPr>
-                                <w:noProof/>
-                              </w:rPr>
-                              <w:fldChar w:fldCharType="end"/>
-                            </w:r>
+                            <w:fldSimple w:instr=" SEQ Figure \* ARABIC ">
+                              <w:r>
+                                <w:rPr>
+                                  <w:noProof/>
+                                </w:rPr>
+                                <w:t>7</w:t>
+                              </w:r>
+                            </w:fldSimple>
                             <w:r>
                               <w:t xml:space="preserve"> Add Button / Issue Ticket</w:t>
                             </w:r>
@@ -6795,27 +6697,14 @@
                             <w:r>
                               <w:t xml:space="preserve">Figure </w:t>
                             </w:r>
-                            <w:r>
-                              <w:fldChar w:fldCharType="begin"/>
-                            </w:r>
-                            <w:r>
-                              <w:instrText xml:space="preserve"> SEQ Figure \* ARABIC </w:instrText>
-                            </w:r>
-                            <w:r>
-                              <w:fldChar w:fldCharType="separate"/>
-                            </w:r>
-                            <w:r>
-                              <w:rPr>
-                                <w:noProof/>
-                              </w:rPr>
-                              <w:t>8</w:t>
-                            </w:r>
-                            <w:r>
-                              <w:rPr>
-                                <w:noProof/>
-                              </w:rPr>
-                              <w:fldChar w:fldCharType="end"/>
-                            </w:r>
+                            <w:fldSimple w:instr=" SEQ Figure \* ARABIC ">
+                              <w:r>
+                                <w:rPr>
+                                  <w:noProof/>
+                                </w:rPr>
+                                <w:t>8</w:t>
+                              </w:r>
+                            </w:fldSimple>
                             <w:r>
                               <w:t xml:space="preserve"> Add Button / Show Message</w:t>
                             </w:r>
@@ -7084,27 +6973,14 @@
       <w:r>
         <w:t xml:space="preserve">Figure </w:t>
       </w:r>
-      <w:r>
-        <w:fldChar w:fldCharType="begin"/>
-      </w:r>
-      <w:r>
-        <w:instrText xml:space="preserve"> SEQ Figure \* ARABIC </w:instrText>
-      </w:r>
-      <w:r>
-        <w:fldChar w:fldCharType="separate"/>
-      </w:r>
-      <w:r>
-        <w:rPr>
-          <w:noProof/>
-        </w:rPr>
-        <w:t>9</w:t>
-      </w:r>
-      <w:r>
-        <w:rPr>
-          <w:noProof/>
-        </w:rPr>
-        <w:fldChar w:fldCharType="end"/>
-      </w:r>
+      <w:fldSimple w:instr=" SEQ Figure \* ARABIC ">
+        <w:r>
+          <w:rPr>
+            <w:noProof/>
+          </w:rPr>
+          <w:t>9</w:t>
+        </w:r>
+      </w:fldSimple>
       <w:r>
         <w:t xml:space="preserve"> Edit Button Form</w:t>
       </w:r>

</xml_diff>

<commit_message>
Added published App | Updated User Manual
</commit_message>
<xml_diff>
--- a/Ticketing-Screen-Designer User Manual.docx
+++ b/Ticketing-Screen-Designer User Manual.docx
@@ -777,77 +777,31 @@
           <w:sz w:val="24"/>
           <w:szCs w:val="24"/>
         </w:rPr>
-        <w:t xml:space="preserve">Copy the </w:t>
-      </w:r>
-      <w:r>
-        <w:rPr>
-          <w:rFonts w:ascii="Courier New" w:eastAsia="Times New Roman" w:hAnsi="Courier New" w:cs="Courier New"/>
-          <w:sz w:val="20"/>
-          <w:szCs w:val="20"/>
-        </w:rPr>
-        <w:t>.exe</w:t>
-      </w:r>
-      <w:r>
-        <w:rPr>
-          <w:rFonts w:ascii="Times New Roman" w:eastAsia="Times New Roman" w:hAnsi="Times New Roman" w:cs="Times New Roman"/>
-          <w:sz w:val="24"/>
-          <w:szCs w:val="24"/>
-        </w:rPr>
-        <w:t xml:space="preserve"> file</w:t>
-      </w:r>
-      <w:r>
-        <w:rPr>
-          <w:rFonts w:ascii="Times New Roman" w:eastAsia="Times New Roman" w:hAnsi="Times New Roman" w:cs="Times New Roman"/>
-          <w:sz w:val="24"/>
-          <w:szCs w:val="24"/>
-        </w:rPr>
-        <w:t xml:space="preserve"> and </w:t>
-      </w:r>
-      <w:r>
-        <w:rPr>
-          <w:rFonts w:ascii="Courier New" w:eastAsia="Times New Roman" w:hAnsi="Courier New" w:cs="Courier New"/>
-          <w:sz w:val="20"/>
-          <w:szCs w:val="20"/>
-        </w:rPr>
-        <w:t xml:space="preserve">Config </w:t>
-      </w:r>
-      <w:r>
-        <w:rPr>
-          <w:rFonts w:asciiTheme="majorBidi" w:eastAsia="Times New Roman" w:hAnsiTheme="majorBidi" w:cstheme="majorBidi"/>
-          <w:sz w:val="24"/>
-          <w:szCs w:val="24"/>
-        </w:rPr>
-        <w:t>folder</w:t>
-      </w:r>
-      <w:r>
-        <w:rPr>
-          <w:rFonts w:ascii="Times New Roman" w:eastAsia="Times New Roman" w:hAnsi="Times New Roman" w:cs="Times New Roman"/>
-          <w:sz w:val="24"/>
-          <w:szCs w:val="24"/>
-        </w:rPr>
-        <w:t xml:space="preserve"> into a dedicated folder.</w:t>
-      </w:r>
-    </w:p>
-    <w:p>
-      <w:pPr>
-        <w:numPr>
-          <w:ilvl w:val="0"/>
-          <w:numId w:val="13"/>
-        </w:numPr>
-        <w:spacing w:before="100" w:beforeAutospacing="1" w:after="100" w:afterAutospacing="1" w:line="240" w:lineRule="auto"/>
-        <w:rPr>
-          <w:rFonts w:ascii="Times New Roman" w:eastAsia="Times New Roman" w:hAnsi="Times New Roman" w:cs="Times New Roman"/>
-          <w:sz w:val="24"/>
-          <w:szCs w:val="24"/>
-        </w:rPr>
-      </w:pPr>
-      <w:r>
-        <w:rPr>
-          <w:rFonts w:ascii="Times New Roman" w:eastAsia="Times New Roman" w:hAnsi="Times New Roman" w:cs="Times New Roman"/>
-          <w:sz w:val="24"/>
-          <w:szCs w:val="24"/>
-        </w:rPr>
-        <w:t>This folder will serve as your application's installation directory.</w:t>
+        <w:t>The</w:t>
+      </w:r>
+      <w:r>
+        <w:rPr>
+          <w:rFonts w:ascii="Times New Roman" w:eastAsia="Times New Roman" w:hAnsi="Times New Roman" w:cs="Times New Roman"/>
+          <w:sz w:val="24"/>
+          <w:szCs w:val="24"/>
+        </w:rPr>
+        <w:t xml:space="preserve"> </w:t>
+      </w:r>
+      <w:r>
+        <w:rPr>
+          <w:rFonts w:ascii="Times New Roman" w:eastAsia="Times New Roman" w:hAnsi="Times New Roman" w:cs="Times New Roman"/>
+          <w:sz w:val="24"/>
+          <w:szCs w:val="24"/>
+        </w:rPr>
+        <w:t xml:space="preserve">“Published App” </w:t>
+      </w:r>
+      <w:r>
+        <w:rPr>
+          <w:rFonts w:ascii="Times New Roman" w:eastAsia="Times New Roman" w:hAnsi="Times New Roman" w:cs="Times New Roman"/>
+          <w:sz w:val="24"/>
+          <w:szCs w:val="24"/>
+        </w:rPr>
+        <w:t>folder will serve as your application's installation directory.</w:t>
       </w:r>
     </w:p>
     <w:p>
@@ -959,7 +913,27 @@
           <w:sz w:val="27"/>
           <w:szCs w:val="27"/>
         </w:rPr>
-        <w:t>C. Restoring the Database Schema</w:t>
+        <w:t xml:space="preserve">C. </w:t>
+      </w:r>
+      <w:r>
+        <w:rPr>
+          <w:rFonts w:ascii="Times New Roman" w:eastAsia="Times New Roman" w:hAnsi="Times New Roman" w:cs="Times New Roman"/>
+          <w:b/>
+          <w:bCs/>
+          <w:sz w:val="27"/>
+          <w:szCs w:val="27"/>
+        </w:rPr>
+        <w:t>Creating/</w:t>
+      </w:r>
+      <w:r>
+        <w:rPr>
+          <w:rFonts w:ascii="Times New Roman" w:eastAsia="Times New Roman" w:hAnsi="Times New Roman" w:cs="Times New Roman"/>
+          <w:b/>
+          <w:bCs/>
+          <w:sz w:val="27"/>
+          <w:szCs w:val="27"/>
+        </w:rPr>
+        <w:t>Restoring the Database Schema</w:t>
       </w:r>
     </w:p>
     <w:p>
@@ -1010,16 +984,40 @@
           <w:sz w:val="20"/>
           <w:szCs w:val="20"/>
         </w:rPr>
-        <w:t>CreateDatabaseScript.sql</w:t>
+        <w:t>TicketingDesignerDB.sql</w:t>
       </w:r>
       <w:proofErr w:type="spellEnd"/>
       <w:r>
         <w:rPr>
-          <w:rFonts w:ascii="Times New Roman" w:eastAsia="Times New Roman" w:hAnsi="Times New Roman" w:cs="Times New Roman"/>
-          <w:sz w:val="24"/>
-          <w:szCs w:val="24"/>
-        </w:rPr>
-        <w:t xml:space="preserve"> file.</w:t>
+          <w:rFonts w:ascii="Courier New" w:eastAsia="Times New Roman" w:hAnsi="Courier New" w:cs="Courier New"/>
+          <w:sz w:val="20"/>
+          <w:szCs w:val="20"/>
+        </w:rPr>
+        <w:t xml:space="preserve"> </w:t>
+      </w:r>
+      <w:r>
+        <w:rPr>
+          <w:rFonts w:ascii="Times New Roman" w:eastAsia="Times New Roman" w:hAnsi="Times New Roman" w:cs="Times New Roman"/>
+          <w:sz w:val="24"/>
+          <w:szCs w:val="24"/>
+        </w:rPr>
+        <w:t>file</w:t>
+      </w:r>
+      <w:r>
+        <w:rPr>
+          <w:rFonts w:ascii="Times New Roman" w:eastAsia="Times New Roman" w:hAnsi="Times New Roman" w:cs="Times New Roman"/>
+          <w:sz w:val="24"/>
+          <w:szCs w:val="24"/>
+        </w:rPr>
+        <w:t xml:space="preserve"> found inside the scripts folder in your application’s directory by opening the file in SSMS then clicking “F5” to execute query</w:t>
+      </w:r>
+      <w:r>
+        <w:rPr>
+          <w:rFonts w:ascii="Times New Roman" w:eastAsia="Times New Roman" w:hAnsi="Times New Roman" w:cs="Times New Roman"/>
+          <w:sz w:val="24"/>
+          <w:szCs w:val="24"/>
+        </w:rPr>
+        <w:t>.</w:t>
       </w:r>
     </w:p>
     <w:p>
@@ -1029,6 +1027,8 @@
       <w:r>
         <w:t>D. Configuring the App Configuration File</w:t>
       </w:r>
+      <w:bookmarkStart w:id="0" w:name="_GoBack"/>
+      <w:bookmarkEnd w:id="0"/>
     </w:p>
     <w:p>
       <w:pPr>
@@ -1123,12 +1123,7 @@
         <w:t>If you are using Windows Authentication (Recommended):</w:t>
       </w:r>
       <w:r>
-        <w:t xml:space="preserve"> This method uses your Windows login credentials to authenticate with SQL Serve</w:t>
-      </w:r>
-      <w:bookmarkStart w:id="0" w:name="_GoBack"/>
-      <w:bookmarkEnd w:id="0"/>
-      <w:r>
-        <w:t>r.</w:t>
+        <w:t xml:space="preserve"> This method uses your Windows login credentials to authenticate with SQL Server.</w:t>
       </w:r>
     </w:p>
     <w:p>
@@ -2052,7 +2047,23 @@
           <w:sz w:val="20"/>
           <w:szCs w:val="20"/>
         </w:rPr>
-        <w:t>.exe</w:t>
+        <w:t>Ticketing-Screen-Designer.UI</w:t>
+      </w:r>
+      <w:r>
+        <w:rPr>
+          <w:rFonts w:ascii="Courier New" w:eastAsia="Times New Roman" w:hAnsi="Courier New" w:cs="Courier New"/>
+          <w:sz w:val="20"/>
+          <w:szCs w:val="20"/>
+        </w:rPr>
+        <w:t>.</w:t>
+      </w:r>
+      <w:r>
+        <w:rPr>
+          <w:rFonts w:ascii="Courier New" w:eastAsia="Times New Roman" w:hAnsi="Courier New" w:cs="Courier New"/>
+          <w:sz w:val="20"/>
+          <w:szCs w:val="20"/>
+        </w:rPr>
+        <w:t>exe</w:t>
       </w:r>
       <w:r>
         <w:rPr>
@@ -2082,7 +2093,57 @@
           <w:sz w:val="24"/>
           <w:szCs w:val="24"/>
         </w:rPr>
-        <w:t>Follow the on-screen prompts to select an existing bank or create a new one.</w:t>
+        <w:t xml:space="preserve">Follow the on-screen prompt to </w:t>
+      </w:r>
+      <w:r>
+        <w:rPr>
+          <w:rFonts w:ascii="Times New Roman" w:eastAsia="Times New Roman" w:hAnsi="Times New Roman" w:cs="Times New Roman"/>
+          <w:sz w:val="24"/>
+          <w:szCs w:val="24"/>
+        </w:rPr>
+        <w:t>access</w:t>
+      </w:r>
+      <w:r>
+        <w:rPr>
+          <w:rFonts w:ascii="Times New Roman" w:eastAsia="Times New Roman" w:hAnsi="Times New Roman" w:cs="Times New Roman"/>
+          <w:sz w:val="24"/>
+          <w:szCs w:val="24"/>
+        </w:rPr>
+        <w:t xml:space="preserve"> an existing bank</w:t>
+      </w:r>
+      <w:r>
+        <w:rPr>
+          <w:rFonts w:ascii="Times New Roman" w:eastAsia="Times New Roman" w:hAnsi="Times New Roman" w:cs="Times New Roman"/>
+          <w:sz w:val="24"/>
+          <w:szCs w:val="24"/>
+        </w:rPr>
+        <w:t xml:space="preserve"> by entering </w:t>
+      </w:r>
+      <w:proofErr w:type="gramStart"/>
+      <w:r>
+        <w:rPr>
+          <w:rFonts w:ascii="Times New Roman" w:eastAsia="Times New Roman" w:hAnsi="Times New Roman" w:cs="Times New Roman"/>
+          <w:sz w:val="24"/>
+          <w:szCs w:val="24"/>
+        </w:rPr>
+        <w:t>it’s</w:t>
+      </w:r>
+      <w:proofErr w:type="gramEnd"/>
+      <w:r>
+        <w:rPr>
+          <w:rFonts w:ascii="Times New Roman" w:eastAsia="Times New Roman" w:hAnsi="Times New Roman" w:cs="Times New Roman"/>
+          <w:sz w:val="24"/>
+          <w:szCs w:val="24"/>
+        </w:rPr>
+        <w:t xml:space="preserve"> name</w:t>
+      </w:r>
+      <w:r>
+        <w:rPr>
+          <w:rFonts w:ascii="Times New Roman" w:eastAsia="Times New Roman" w:hAnsi="Times New Roman" w:cs="Times New Roman"/>
+          <w:sz w:val="24"/>
+          <w:szCs w:val="24"/>
+        </w:rPr>
+        <w:t xml:space="preserve"> or create a new one.</w:t>
       </w:r>
     </w:p>
     <w:p>
@@ -2174,7 +2235,31 @@
           <w:sz w:val="24"/>
           <w:szCs w:val="24"/>
         </w:rPr>
-        <w:t>The first screen upon launching the application allows you to select an existing bank or create a new one.</w:t>
+        <w:t xml:space="preserve">The first screen upon launching the application allows you to </w:t>
+      </w:r>
+      <w:r>
+        <w:rPr>
+          <w:rFonts w:ascii="Times New Roman" w:eastAsia="Times New Roman" w:hAnsi="Times New Roman" w:cs="Times New Roman"/>
+          <w:sz w:val="24"/>
+          <w:szCs w:val="24"/>
+        </w:rPr>
+        <w:t>access</w:t>
+      </w:r>
+      <w:r>
+        <w:rPr>
+          <w:rFonts w:ascii="Times New Roman" w:eastAsia="Times New Roman" w:hAnsi="Times New Roman" w:cs="Times New Roman"/>
+          <w:sz w:val="24"/>
+          <w:szCs w:val="24"/>
+        </w:rPr>
+        <w:t xml:space="preserve"> </w:t>
+      </w:r>
+      <w:r>
+        <w:rPr>
+          <w:rFonts w:ascii="Times New Roman" w:eastAsia="Times New Roman" w:hAnsi="Times New Roman" w:cs="Times New Roman"/>
+          <w:sz w:val="24"/>
+          <w:szCs w:val="24"/>
+        </w:rPr>
+        <w:t>an existing bank or create a new one.</w:t>
       </w:r>
     </w:p>
     <w:p>
@@ -2594,11 +2679,20 @@
     <w:p>
       <w:pPr>
         <w:pStyle w:val="Heading4"/>
-      </w:pPr>
-      <w:r>
         <w:rPr>
           <w:rFonts w:ascii="Segoe UI Emoji" w:hAnsi="Segoe UI Emoji" w:cs="Segoe UI Emoji"/>
         </w:rPr>
+      </w:pPr>
+    </w:p>
+    <w:p>
+      <w:pPr>
+        <w:pStyle w:val="Heading4"/>
+      </w:pPr>
+      <w:r>
+        <w:rPr>
+          <w:rFonts w:ascii="Segoe UI Emoji" w:hAnsi="Segoe UI Emoji" w:cs="Segoe UI Emoji"/>
+        </w:rPr>
+        <w:lastRenderedPageBreak/>
         <w:t>✅</w:t>
       </w:r>
       <w:r>
@@ -2652,7 +2746,6 @@
         <w:rPr>
           <w:rStyle w:val="hljs-keyword"/>
         </w:rPr>
-        <w:lastRenderedPageBreak/>
         <w:t>INSERT</w:t>
       </w:r>
       <w:r>
@@ -3438,10 +3531,10 @@
               <wp:anchor distT="45720" distB="45720" distL="114300" distR="114300" simplePos="0" relativeHeight="251674624" behindDoc="0" locked="0" layoutInCell="1" allowOverlap="1" wp14:anchorId="6DA40472" wp14:editId="484B789C">
                 <wp:simplePos x="0" y="0"/>
                 <wp:positionH relativeFrom="margin">
-                  <wp:posOffset>1865436</wp:posOffset>
+                  <wp:align>center</wp:align>
                 </wp:positionH>
                 <wp:positionV relativeFrom="paragraph">
-                  <wp:posOffset>1353213</wp:posOffset>
+                  <wp:posOffset>1356222</wp:posOffset>
                 </wp:positionV>
                 <wp:extent cx="1624084" cy="1404620"/>
                 <wp:effectExtent l="0" t="0" r="0" b="0"/>
@@ -3510,7 +3603,7 @@
                 <v:stroke joinstyle="miter"/>
                 <v:path gradientshapeok="t" o:connecttype="rect"/>
               </v:shapetype>
-              <v:shape id="Text Box 2" o:spid="_x0000_s1026" type="#_x0000_t202" style="position:absolute;margin-left:146.9pt;margin-top:106.55pt;width:127.9pt;height:110.6pt;z-index:251674624;visibility:visible;mso-wrap-style:square;mso-width-percent:0;mso-height-percent:200;mso-wrap-distance-left:9pt;mso-wrap-distance-top:3.6pt;mso-wrap-distance-right:9pt;mso-wrap-distance-bottom:3.6pt;mso-position-horizontal:absolute;mso-position-horizontal-relative:margin;mso-position-vertical:absolute;mso-position-vertical-relative:text;mso-width-percent:0;mso-height-percent:200;mso-width-relative:margin;mso-height-relative:margin;v-text-anchor:top" o:gfxdata="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" filled="f" stroked="f">
+              <v:shape id="Text Box 2" o:spid="_x0000_s1026" type="#_x0000_t202" style="position:absolute;margin-left:0;margin-top:106.8pt;width:127.9pt;height:110.6pt;z-index:251674624;visibility:visible;mso-wrap-style:square;mso-width-percent:0;mso-height-percent:200;mso-wrap-distance-left:9pt;mso-wrap-distance-top:3.6pt;mso-wrap-distance-right:9pt;mso-wrap-distance-bottom:3.6pt;mso-position-horizontal:center;mso-position-horizontal-relative:margin;mso-position-vertical:absolute;mso-position-vertical-relative:text;mso-width-percent:0;mso-height-percent:200;mso-width-relative:margin;mso-height-relative:margin;v-text-anchor:top" o:gfxdata="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" filled="f" stroked="f">
                 <v:textbox style="mso-fit-shape-to-text:t">
                   <w:txbxContent>
                     <w:p>
@@ -3544,10 +3637,10 @@
               <wp:anchor distT="0" distB="0" distL="114300" distR="114300" simplePos="0" relativeHeight="251672576" behindDoc="0" locked="0" layoutInCell="1" allowOverlap="1" wp14:anchorId="75C45327" wp14:editId="07B6F748">
                 <wp:simplePos x="0" y="0"/>
                 <wp:positionH relativeFrom="column">
-                  <wp:posOffset>1666488</wp:posOffset>
+                  <wp:posOffset>1982056</wp:posOffset>
                 </wp:positionH>
                 <wp:positionV relativeFrom="paragraph">
-                  <wp:posOffset>1471571</wp:posOffset>
+                  <wp:posOffset>1493548</wp:posOffset>
                 </wp:positionV>
                 <wp:extent cx="177421" cy="6824"/>
                 <wp:effectExtent l="0" t="57150" r="32385" b="88900"/>
@@ -3596,11 +3689,11 @@
           </mc:Choice>
           <mc:Fallback>
             <w:pict>
-              <v:shapetype w14:anchorId="241331F4" id="_x0000_t32" coordsize="21600,21600" o:spt="32" o:oned="t" path="m,l21600,21600e" filled="f">
+              <v:shapetype w14:anchorId="20562017" id="_x0000_t32" coordsize="21600,21600" o:spt="32" o:oned="t" path="m,l21600,21600e" filled="f">
                 <v:path arrowok="t" fillok="f" o:connecttype="none"/>
                 <o:lock v:ext="edit" shapetype="t"/>
               </v:shapetype>
-              <v:shape id="Straight Arrow Connector 13" o:spid="_x0000_s1026" type="#_x0000_t32" style="position:absolute;margin-left:131.2pt;margin-top:115.85pt;width:13.95pt;height:.55pt;z-index:251672576;visibility:visible;mso-wrap-style:square;mso-wrap-distance-left:9pt;mso-wrap-distance-top:0;mso-wrap-distance-right:9pt;mso-wrap-distance-bottom:0;mso-position-horizontal:absolute;mso-position-horizontal-relative:text;mso-position-vertical:absolute;mso-position-vertical-relative:text" o:gfxdata="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" strokecolor="red" strokeweight="1.5pt">
+              <v:shape id="Straight Arrow Connector 13" o:spid="_x0000_s1026" type="#_x0000_t32" style="position:absolute;margin-left:156.05pt;margin-top:117.6pt;width:13.95pt;height:.55pt;z-index:251672576;visibility:visible;mso-wrap-style:square;mso-wrap-distance-left:9pt;mso-wrap-distance-top:0;mso-wrap-distance-right:9pt;mso-wrap-distance-bottom:0;mso-position-horizontal:absolute;mso-position-horizontal-relative:text;mso-position-vertical:absolute;mso-position-vertical-relative:text" o:gfxdata="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" strokecolor="red" strokeweight="1.5pt">
                 <v:stroke endarrow="block" joinstyle="miter"/>
               </v:shape>
             </w:pict>
@@ -3622,13 +3715,13 @@
               <wp:anchor distT="0" distB="0" distL="114300" distR="114300" simplePos="0" relativeHeight="251670528" behindDoc="0" locked="0" layoutInCell="1" allowOverlap="1" wp14:anchorId="16355A88" wp14:editId="17DEDBCA">
                 <wp:simplePos x="0" y="0"/>
                 <wp:positionH relativeFrom="margin">
-                  <wp:posOffset>79403</wp:posOffset>
+                  <wp:posOffset>39757</wp:posOffset>
                 </wp:positionH>
                 <wp:positionV relativeFrom="paragraph">
-                  <wp:posOffset>1121051</wp:posOffset>
+                  <wp:posOffset>1065475</wp:posOffset>
                 </wp:positionV>
-                <wp:extent cx="1542553" cy="620395"/>
-                <wp:effectExtent l="0" t="0" r="19685" b="27305"/>
+                <wp:extent cx="1900306" cy="676054"/>
+                <wp:effectExtent l="0" t="0" r="24130" b="10160"/>
                 <wp:wrapNone/>
                 <wp:docPr id="12" name="Rectangle 12"/>
                 <wp:cNvGraphicFramePr/>
@@ -3639,7 +3732,7 @@
                       <wps:spPr>
                         <a:xfrm>
                           <a:off x="0" y="0"/>
-                          <a:ext cx="1542553" cy="620395"/>
+                          <a:ext cx="1900306" cy="676054"/>
                         </a:xfrm>
                         <a:prstGeom prst="rect">
                           <a:avLst/>
@@ -3687,7 +3780,365 @@
           </mc:Choice>
           <mc:Fallback>
             <w:pict>
-              <v:rect w14:anchorId="4FB6BE20" id="Rectangle 12" o:spid="_x0000_s1026" style="position:absolute;margin-left:6.25pt;margin-top:88.25pt;width:121.45pt;height:48.85pt;z-index:251670528;visibility:visible;mso-wrap-style:square;mso-width-percent:0;mso-height-percent:0;mso-wrap-distance-left:9pt;mso-wrap-distance-top:0;mso-wrap-distance-right:9pt;mso-wrap-distance-bottom:0;mso-position-horizontal:absolute;mso-position-horizontal-relative:margin;mso-position-vertical:absolute;mso-position-vertical-relative:text;mso-width-percent:0;mso-height-percent:0;mso-width-relative:margin;mso-height-relative:margin;v-text-anchor:middle" o:gfxdata="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" filled="f" strokecolor="red" strokeweight="1pt">
+              <v:rect w14:anchorId="528A4A00" id="Rectangle 12" o:spid="_x0000_s1026" style="position:absolute;margin-left:3.15pt;margin-top:83.9pt;width:149.65pt;height:53.25pt;z-index:251670528;visibility:visible;mso-wrap-style:square;mso-width-percent:0;mso-height-percent:0;mso-wrap-distance-left:9pt;mso-wrap-distance-top:0;mso-wrap-distance-right:9pt;mso-wrap-distance-bottom:0;mso-position-horizontal:absolute;mso-position-horizontal-relative:margin;mso-position-vertical:absolute;mso-position-vertical-relative:text;mso-width-percent:0;mso-height-percent:0;mso-width-relative:margin;mso-height-relative:margin;v-text-anchor:middle" o:gfxdata="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" filled="f" strokecolor="red" strokeweight="1pt">
+                <w10:wrap anchorx="margin"/>
+              </v:rect>
+            </w:pict>
+          </mc:Fallback>
+        </mc:AlternateContent>
+      </w:r>
+      <w:r>
+        <w:rPr>
+          <w:noProof/>
+        </w:rPr>
+        <mc:AlternateContent>
+          <mc:Choice Requires="wps">
+            <w:drawing>
+              <wp:anchor distT="45720" distB="45720" distL="114300" distR="114300" simplePos="0" relativeHeight="251665408" behindDoc="0" locked="0" layoutInCell="1" allowOverlap="1" wp14:anchorId="0DE137C7" wp14:editId="14257CF3">
+                <wp:simplePos x="0" y="0"/>
+                <wp:positionH relativeFrom="column">
+                  <wp:posOffset>2726800</wp:posOffset>
+                </wp:positionH>
+                <wp:positionV relativeFrom="paragraph">
+                  <wp:posOffset>646430</wp:posOffset>
+                </wp:positionV>
+                <wp:extent cx="1282700" cy="1404620"/>
+                <wp:effectExtent l="0" t="0" r="0" b="0"/>
+                <wp:wrapNone/>
+                <wp:docPr id="5" name="Text Box 2"/>
+                <wp:cNvGraphicFramePr>
+                  <a:graphicFrameLocks xmlns:a="http://schemas.openxmlformats.org/drawingml/2006/main"/>
+                </wp:cNvGraphicFramePr>
+                <a:graphic xmlns:a="http://schemas.openxmlformats.org/drawingml/2006/main">
+                  <a:graphicData uri="http://schemas.microsoft.com/office/word/2010/wordprocessingShape">
+                    <wps:wsp>
+                      <wps:cNvSpPr txBox="1">
+                        <a:spLocks noChangeArrowheads="1"/>
+                      </wps:cNvSpPr>
+                      <wps:spPr bwMode="auto">
+                        <a:xfrm>
+                          <a:off x="0" y="0"/>
+                          <a:ext cx="1282700" cy="1404620"/>
+                        </a:xfrm>
+                        <a:prstGeom prst="rect">
+                          <a:avLst/>
+                        </a:prstGeom>
+                        <a:noFill/>
+                        <a:ln w="9525">
+                          <a:noFill/>
+                          <a:miter lim="800000"/>
+                          <a:headEnd/>
+                          <a:tailEnd/>
+                        </a:ln>
+                      </wps:spPr>
+                      <wps:txbx>
+                        <w:txbxContent>
+                          <w:p>
+                            <w:pPr>
+                              <w:rPr>
+                                <w:color w:val="FF0000"/>
+                              </w:rPr>
+                            </w:pPr>
+                            <w:r>
+                              <w:rPr>
+                                <w:color w:val="FF0000"/>
+                              </w:rPr>
+                              <w:t>Screen Controls</w:t>
+                            </w:r>
+                          </w:p>
+                        </w:txbxContent>
+                      </wps:txbx>
+                      <wps:bodyPr rot="0" vert="horz" wrap="square" lIns="91440" tIns="45720" rIns="91440" bIns="45720" anchor="t" anchorCtr="0">
+                        <a:spAutoFit/>
+                      </wps:bodyPr>
+                    </wps:wsp>
+                  </a:graphicData>
+                </a:graphic>
+                <wp14:sizeRelH relativeFrom="margin">
+                  <wp14:pctWidth>0</wp14:pctWidth>
+                </wp14:sizeRelH>
+                <wp14:sizeRelV relativeFrom="margin">
+                  <wp14:pctHeight>20000</wp14:pctHeight>
+                </wp14:sizeRelV>
+              </wp:anchor>
+            </w:drawing>
+          </mc:Choice>
+          <mc:Fallback>
+            <w:pict>
+              <v:shape w14:anchorId="0DE137C7" id="_x0000_s1027" type="#_x0000_t202" style="position:absolute;margin-left:214.7pt;margin-top:50.9pt;width:101pt;height:110.6pt;z-index:251665408;visibility:visible;mso-wrap-style:square;mso-width-percent:0;mso-height-percent:200;mso-wrap-distance-left:9pt;mso-wrap-distance-top:3.6pt;mso-wrap-distance-right:9pt;mso-wrap-distance-bottom:3.6pt;mso-position-horizontal:absolute;mso-position-horizontal-relative:text;mso-position-vertical:absolute;mso-position-vertical-relative:text;mso-width-percent:0;mso-height-percent:200;mso-width-relative:margin;mso-height-relative:margin;v-text-anchor:top" o:gfxdata="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" filled="f" stroked="f">
+                <v:textbox style="mso-fit-shape-to-text:t">
+                  <w:txbxContent>
+                    <w:p>
+                      <w:pPr>
+                        <w:rPr>
+                          <w:color w:val="FF0000"/>
+                        </w:rPr>
+                      </w:pPr>
+                      <w:r>
+                        <w:rPr>
+                          <w:color w:val="FF0000"/>
+                        </w:rPr>
+                        <w:t>Screen Controls</w:t>
+                      </w:r>
+                    </w:p>
+                  </w:txbxContent>
+                </v:textbox>
+              </v:shape>
+            </w:pict>
+          </mc:Fallback>
+        </mc:AlternateContent>
+      </w:r>
+      <w:r>
+        <w:rPr>
+          <w:noProof/>
+        </w:rPr>
+        <mc:AlternateContent>
+          <mc:Choice Requires="wps">
+            <w:drawing>
+              <wp:anchor distT="45720" distB="45720" distL="114300" distR="114300" simplePos="0" relativeHeight="251661312" behindDoc="0" locked="0" layoutInCell="1" allowOverlap="1">
+                <wp:simplePos x="0" y="0"/>
+                <wp:positionH relativeFrom="column">
+                  <wp:posOffset>3753015</wp:posOffset>
+                </wp:positionH>
+                <wp:positionV relativeFrom="paragraph">
+                  <wp:posOffset>351183</wp:posOffset>
+                </wp:positionV>
+                <wp:extent cx="941070" cy="1404620"/>
+                <wp:effectExtent l="0" t="0" r="0" b="0"/>
+                <wp:wrapNone/>
+                <wp:docPr id="217" name="Text Box 2"/>
+                <wp:cNvGraphicFramePr>
+                  <a:graphicFrameLocks xmlns:a="http://schemas.openxmlformats.org/drawingml/2006/main"/>
+                </wp:cNvGraphicFramePr>
+                <a:graphic xmlns:a="http://schemas.openxmlformats.org/drawingml/2006/main">
+                  <a:graphicData uri="http://schemas.microsoft.com/office/word/2010/wordprocessingShape">
+                    <wps:wsp>
+                      <wps:cNvSpPr txBox="1">
+                        <a:spLocks noChangeArrowheads="1"/>
+                      </wps:cNvSpPr>
+                      <wps:spPr bwMode="auto">
+                        <a:xfrm>
+                          <a:off x="0" y="0"/>
+                          <a:ext cx="941070" cy="1404620"/>
+                        </a:xfrm>
+                        <a:prstGeom prst="rect">
+                          <a:avLst/>
+                        </a:prstGeom>
+                        <a:noFill/>
+                        <a:ln w="9525">
+                          <a:noFill/>
+                          <a:miter lim="800000"/>
+                          <a:headEnd/>
+                          <a:tailEnd/>
+                        </a:ln>
+                      </wps:spPr>
+                      <wps:txbx>
+                        <w:txbxContent>
+                          <w:p>
+                            <w:pPr>
+                              <w:rPr>
+                                <w:color w:val="FF0000"/>
+                              </w:rPr>
+                            </w:pPr>
+                            <w:r>
+                              <w:rPr>
+                                <w:color w:val="FF0000"/>
+                              </w:rPr>
+                              <w:t>Bank name</w:t>
+                            </w:r>
+                          </w:p>
+                        </w:txbxContent>
+                      </wps:txbx>
+                      <wps:bodyPr rot="0" vert="horz" wrap="square" lIns="91440" tIns="45720" rIns="91440" bIns="45720" anchor="t" anchorCtr="0">
+                        <a:spAutoFit/>
+                      </wps:bodyPr>
+                    </wps:wsp>
+                  </a:graphicData>
+                </a:graphic>
+                <wp14:sizeRelH relativeFrom="margin">
+                  <wp14:pctWidth>0</wp14:pctWidth>
+                </wp14:sizeRelH>
+                <wp14:sizeRelV relativeFrom="margin">
+                  <wp14:pctHeight>20000</wp14:pctHeight>
+                </wp14:sizeRelV>
+              </wp:anchor>
+            </w:drawing>
+          </mc:Choice>
+          <mc:Fallback>
+            <w:pict>
+              <v:shape id="_x0000_s1028" type="#_x0000_t202" style="position:absolute;margin-left:295.5pt;margin-top:27.65pt;width:74.1pt;height:110.6pt;z-index:251661312;visibility:visible;mso-wrap-style:square;mso-width-percent:0;mso-height-percent:200;mso-wrap-distance-left:9pt;mso-wrap-distance-top:3.6pt;mso-wrap-distance-right:9pt;mso-wrap-distance-bottom:3.6pt;mso-position-horizontal:absolute;mso-position-horizontal-relative:text;mso-position-vertical:absolute;mso-position-vertical-relative:text;mso-width-percent:0;mso-height-percent:200;mso-width-relative:margin;mso-height-relative:margin;v-text-anchor:top" o:gfxdata="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" filled="f" stroked="f">
+                <v:textbox style="mso-fit-shape-to-text:t">
+                  <w:txbxContent>
+                    <w:p>
+                      <w:pPr>
+                        <w:rPr>
+                          <w:color w:val="FF0000"/>
+                        </w:rPr>
+                      </w:pPr>
+                      <w:r>
+                        <w:rPr>
+                          <w:color w:val="FF0000"/>
+                        </w:rPr>
+                        <w:t>Bank name</w:t>
+                      </w:r>
+                    </w:p>
+                  </w:txbxContent>
+                </v:textbox>
+              </v:shape>
+            </w:pict>
+          </mc:Fallback>
+        </mc:AlternateContent>
+      </w:r>
+      <w:r>
+        <w:rPr>
+          <w:noProof/>
+        </w:rPr>
+        <mc:AlternateContent>
+          <mc:Choice Requires="wps">
+            <w:drawing>
+              <wp:anchor distT="0" distB="0" distL="114300" distR="114300" simplePos="0" relativeHeight="251666432" behindDoc="0" locked="0" layoutInCell="1" allowOverlap="1">
+                <wp:simplePos x="0" y="0"/>
+                <wp:positionH relativeFrom="column">
+                  <wp:posOffset>2568243</wp:posOffset>
+                </wp:positionH>
+                <wp:positionV relativeFrom="paragraph">
+                  <wp:posOffset>796567</wp:posOffset>
+                </wp:positionV>
+                <wp:extent cx="177421" cy="6824"/>
+                <wp:effectExtent l="0" t="57150" r="32385" b="88900"/>
+                <wp:wrapNone/>
+                <wp:docPr id="10" name="Straight Arrow Connector 10"/>
+                <wp:cNvGraphicFramePr/>
+                <a:graphic xmlns:a="http://schemas.openxmlformats.org/drawingml/2006/main">
+                  <a:graphicData uri="http://schemas.microsoft.com/office/word/2010/wordprocessingShape">
+                    <wps:wsp>
+                      <wps:cNvCnPr/>
+                      <wps:spPr>
+                        <a:xfrm>
+                          <a:off x="0" y="0"/>
+                          <a:ext cx="177421" cy="6824"/>
+                        </a:xfrm>
+                        <a:prstGeom prst="straightConnector1">
+                          <a:avLst/>
+                        </a:prstGeom>
+                        <a:ln>
+                          <a:solidFill>
+                            <a:srgbClr val="FF0000"/>
+                          </a:solidFill>
+                          <a:tailEnd type="triangle"/>
+                        </a:ln>
+                      </wps:spPr>
+                      <wps:style>
+                        <a:lnRef idx="3">
+                          <a:schemeClr val="accent2"/>
+                        </a:lnRef>
+                        <a:fillRef idx="0">
+                          <a:schemeClr val="accent2"/>
+                        </a:fillRef>
+                        <a:effectRef idx="2">
+                          <a:schemeClr val="accent2"/>
+                        </a:effectRef>
+                        <a:fontRef idx="minor">
+                          <a:schemeClr val="tx1"/>
+                        </a:fontRef>
+                      </wps:style>
+                      <wps:bodyPr/>
+                    </wps:wsp>
+                  </a:graphicData>
+                </a:graphic>
+              </wp:anchor>
+            </w:drawing>
+          </mc:Choice>
+          <mc:Fallback>
+            <w:pict>
+              <v:shape w14:anchorId="53D62FD6" id="Straight Arrow Connector 10" o:spid="_x0000_s1026" type="#_x0000_t32" style="position:absolute;margin-left:202.2pt;margin-top:62.7pt;width:13.95pt;height:.55pt;z-index:251666432;visibility:visible;mso-wrap-style:square;mso-wrap-distance-left:9pt;mso-wrap-distance-top:0;mso-wrap-distance-right:9pt;mso-wrap-distance-bottom:0;mso-position-horizontal:absolute;mso-position-horizontal-relative:text;mso-position-vertical:absolute;mso-position-vertical-relative:text" o:gfxdata="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" strokecolor="red" strokeweight="1.5pt">
+                <v:stroke endarrow="block" joinstyle="miter"/>
+              </v:shape>
+            </w:pict>
+          </mc:Fallback>
+        </mc:AlternateContent>
+      </w:r>
+      <w:r>
+        <w:rPr>
+          <w:rFonts w:ascii="Times New Roman" w:eastAsia="Times New Roman" w:hAnsi="Times New Roman" w:cs="Times New Roman"/>
+          <w:b/>
+          <w:bCs/>
+          <w:noProof/>
+          <w:sz w:val="36"/>
+          <w:szCs w:val="36"/>
+        </w:rPr>
+        <mc:AlternateContent>
+          <mc:Choice Requires="wps">
+            <w:drawing>
+              <wp:anchor distT="0" distB="0" distL="114300" distR="114300" simplePos="0" relativeHeight="251663360" behindDoc="0" locked="0" layoutInCell="1" allowOverlap="1" wp14:anchorId="0B7616E4" wp14:editId="4C58DE54">
+                <wp:simplePos x="0" y="0"/>
+                <wp:positionH relativeFrom="margin">
+                  <wp:posOffset>31805</wp:posOffset>
+                </wp:positionH>
+                <wp:positionV relativeFrom="paragraph">
+                  <wp:posOffset>620202</wp:posOffset>
+                </wp:positionV>
+                <wp:extent cx="2528515" cy="214685"/>
+                <wp:effectExtent l="0" t="0" r="24765" b="13970"/>
+                <wp:wrapNone/>
+                <wp:docPr id="4" name="Rectangle 4"/>
+                <wp:cNvGraphicFramePr/>
+                <a:graphic xmlns:a="http://schemas.openxmlformats.org/drawingml/2006/main">
+                  <a:graphicData uri="http://schemas.microsoft.com/office/word/2010/wordprocessingShape">
+                    <wps:wsp>
+                      <wps:cNvSpPr/>
+                      <wps:spPr>
+                        <a:xfrm>
+                          <a:off x="0" y="0"/>
+                          <a:ext cx="2528515" cy="214685"/>
+                        </a:xfrm>
+                        <a:prstGeom prst="rect">
+                          <a:avLst/>
+                        </a:prstGeom>
+                        <a:noFill/>
+                        <a:ln>
+                          <a:solidFill>
+                            <a:srgbClr val="FF0000"/>
+                          </a:solidFill>
+                        </a:ln>
+                      </wps:spPr>
+                      <wps:style>
+                        <a:lnRef idx="2">
+                          <a:schemeClr val="accent1">
+                            <a:shade val="50000"/>
+                          </a:schemeClr>
+                        </a:lnRef>
+                        <a:fillRef idx="1">
+                          <a:schemeClr val="accent1"/>
+                        </a:fillRef>
+                        <a:effectRef idx="0">
+                          <a:schemeClr val="accent1"/>
+                        </a:effectRef>
+                        <a:fontRef idx="minor">
+                          <a:schemeClr val="lt1"/>
+                        </a:fontRef>
+                      </wps:style>
+                      <wps:bodyPr rot="0" spcFirstLastPara="0" vertOverflow="overflow" horzOverflow="overflow" vert="horz" wrap="square" lIns="91440" tIns="45720" rIns="91440" bIns="45720" numCol="1" spcCol="0" rtlCol="0" fromWordArt="0" anchor="ctr" anchorCtr="0" forceAA="0" compatLnSpc="1">
+                        <a:prstTxWarp prst="textNoShape">
+                          <a:avLst/>
+                        </a:prstTxWarp>
+                        <a:noAutofit/>
+                      </wps:bodyPr>
+                    </wps:wsp>
+                  </a:graphicData>
+                </a:graphic>
+                <wp14:sizeRelH relativeFrom="margin">
+                  <wp14:pctWidth>0</wp14:pctWidth>
+                </wp14:sizeRelH>
+                <wp14:sizeRelV relativeFrom="margin">
+                  <wp14:pctHeight>0</wp14:pctHeight>
+                </wp14:sizeRelV>
+              </wp:anchor>
+            </w:drawing>
+          </mc:Choice>
+          <mc:Fallback>
+            <w:pict>
+              <v:rect w14:anchorId="7B97133E" id="Rectangle 4" o:spid="_x0000_s1026" style="position:absolute;margin-left:2.5pt;margin-top:48.85pt;width:199.1pt;height:16.9pt;z-index:251663360;visibility:visible;mso-wrap-style:square;mso-width-percent:0;mso-height-percent:0;mso-wrap-distance-left:9pt;mso-wrap-distance-top:0;mso-wrap-distance-right:9pt;mso-wrap-distance-bottom:0;mso-position-horizontal:absolute;mso-position-horizontal-relative:margin;mso-position-vertical:absolute;mso-position-vertical-relative:text;mso-width-percent:0;mso-height-percent:0;mso-width-relative:margin;mso-height-relative:margin;v-text-anchor:middle" o:gfxdata="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" filled="f" strokecolor="red" strokeweight="1pt">
                 <w10:wrap anchorx="margin"/>
               </v:rect>
             </w:pict>
@@ -3762,278 +4213,7 @@
           </mc:Choice>
           <mc:Fallback>
             <w:pict>
-              <v:shape w14:anchorId="434D2D5E" id="Straight Arrow Connector 11" o:spid="_x0000_s1026" type="#_x0000_t32" style="position:absolute;margin-left:280.4pt;margin-top:37.95pt;width:13.95pt;height:.5pt;z-index:251668480;visibility:visible;mso-wrap-style:square;mso-width-percent:0;mso-height-percent:0;mso-wrap-distance-left:9pt;mso-wrap-distance-top:0;mso-wrap-distance-right:9pt;mso-wrap-distance-bottom:0;mso-position-horizontal:absolute;mso-position-horizontal-relative:text;mso-position-vertical:absolute;mso-position-vertical-relative:text;mso-width-percent:0;mso-height-percent:0;mso-width-relative:margin;mso-height-relative:margin" o:gfxdata="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" strokecolor="red" strokeweight="1.5pt">
-                <v:stroke endarrow="block" joinstyle="miter"/>
-              </v:shape>
-            </w:pict>
-          </mc:Fallback>
-        </mc:AlternateContent>
-      </w:r>
-      <w:r>
-        <w:rPr>
-          <w:noProof/>
-        </w:rPr>
-        <mc:AlternateContent>
-          <mc:Choice Requires="wps">
-            <w:drawing>
-              <wp:anchor distT="45720" distB="45720" distL="114300" distR="114300" simplePos="0" relativeHeight="251665408" behindDoc="0" locked="0" layoutInCell="1" allowOverlap="1" wp14:anchorId="0DE137C7" wp14:editId="14257CF3">
-                <wp:simplePos x="0" y="0"/>
-                <wp:positionH relativeFrom="column">
-                  <wp:posOffset>3037205</wp:posOffset>
-                </wp:positionH>
-                <wp:positionV relativeFrom="paragraph">
-                  <wp:posOffset>670560</wp:posOffset>
-                </wp:positionV>
-                <wp:extent cx="1282700" cy="1404620"/>
-                <wp:effectExtent l="0" t="0" r="0" b="0"/>
-                <wp:wrapNone/>
-                <wp:docPr id="5" name="Text Box 2"/>
-                <wp:cNvGraphicFramePr>
-                  <a:graphicFrameLocks xmlns:a="http://schemas.openxmlformats.org/drawingml/2006/main"/>
-                </wp:cNvGraphicFramePr>
-                <a:graphic xmlns:a="http://schemas.openxmlformats.org/drawingml/2006/main">
-                  <a:graphicData uri="http://schemas.microsoft.com/office/word/2010/wordprocessingShape">
-                    <wps:wsp>
-                      <wps:cNvSpPr txBox="1">
-                        <a:spLocks noChangeArrowheads="1"/>
-                      </wps:cNvSpPr>
-                      <wps:spPr bwMode="auto">
-                        <a:xfrm>
-                          <a:off x="0" y="0"/>
-                          <a:ext cx="1282700" cy="1404620"/>
-                        </a:xfrm>
-                        <a:prstGeom prst="rect">
-                          <a:avLst/>
-                        </a:prstGeom>
-                        <a:noFill/>
-                        <a:ln w="9525">
-                          <a:noFill/>
-                          <a:miter lim="800000"/>
-                          <a:headEnd/>
-                          <a:tailEnd/>
-                        </a:ln>
-                      </wps:spPr>
-                      <wps:txbx>
-                        <w:txbxContent>
-                          <w:p>
-                            <w:pPr>
-                              <w:rPr>
-                                <w:color w:val="FF0000"/>
-                              </w:rPr>
-                            </w:pPr>
-                            <w:r>
-                              <w:rPr>
-                                <w:color w:val="FF0000"/>
-                              </w:rPr>
-                              <w:t>Screen Controls</w:t>
-                            </w:r>
-                          </w:p>
-                        </w:txbxContent>
-                      </wps:txbx>
-                      <wps:bodyPr rot="0" vert="horz" wrap="square" lIns="91440" tIns="45720" rIns="91440" bIns="45720" anchor="t" anchorCtr="0">
-                        <a:spAutoFit/>
-                      </wps:bodyPr>
-                    </wps:wsp>
-                  </a:graphicData>
-                </a:graphic>
-                <wp14:sizeRelH relativeFrom="margin">
-                  <wp14:pctWidth>0</wp14:pctWidth>
-                </wp14:sizeRelH>
-                <wp14:sizeRelV relativeFrom="margin">
-                  <wp14:pctHeight>20000</wp14:pctHeight>
-                </wp14:sizeRelV>
-              </wp:anchor>
-            </w:drawing>
-          </mc:Choice>
-          <mc:Fallback>
-            <w:pict>
-              <v:shape w14:anchorId="0DE137C7" id="_x0000_s1027" type="#_x0000_t202" style="position:absolute;margin-left:239.15pt;margin-top:52.8pt;width:101pt;height:110.6pt;z-index:251665408;visibility:visible;mso-wrap-style:square;mso-width-percent:0;mso-height-percent:200;mso-wrap-distance-left:9pt;mso-wrap-distance-top:3.6pt;mso-wrap-distance-right:9pt;mso-wrap-distance-bottom:3.6pt;mso-position-horizontal:absolute;mso-position-horizontal-relative:text;mso-position-vertical:absolute;mso-position-vertical-relative:text;mso-width-percent:0;mso-height-percent:200;mso-width-relative:margin;mso-height-relative:margin;v-text-anchor:top" o:gfxdata="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" filled="f" stroked="f">
-                <v:textbox style="mso-fit-shape-to-text:t">
-                  <w:txbxContent>
-                    <w:p>
-                      <w:pPr>
-                        <w:rPr>
-                          <w:color w:val="FF0000"/>
-                        </w:rPr>
-                      </w:pPr>
-                      <w:r>
-                        <w:rPr>
-                          <w:color w:val="FF0000"/>
-                        </w:rPr>
-                        <w:t>Screen Controls</w:t>
-                      </w:r>
-                    </w:p>
-                  </w:txbxContent>
-                </v:textbox>
-              </v:shape>
-            </w:pict>
-          </mc:Fallback>
-        </mc:AlternateContent>
-      </w:r>
-      <w:r>
-        <w:rPr>
-          <w:noProof/>
-        </w:rPr>
-        <mc:AlternateContent>
-          <mc:Choice Requires="wps">
-            <w:drawing>
-              <wp:anchor distT="45720" distB="45720" distL="114300" distR="114300" simplePos="0" relativeHeight="251661312" behindDoc="0" locked="0" layoutInCell="1" allowOverlap="1">
-                <wp:simplePos x="0" y="0"/>
-                <wp:positionH relativeFrom="column">
-                  <wp:posOffset>3657600</wp:posOffset>
-                </wp:positionH>
-                <wp:positionV relativeFrom="paragraph">
-                  <wp:posOffset>335280</wp:posOffset>
-                </wp:positionV>
-                <wp:extent cx="941070" cy="1404620"/>
-                <wp:effectExtent l="0" t="0" r="0" b="0"/>
-                <wp:wrapNone/>
-                <wp:docPr id="217" name="Text Box 2"/>
-                <wp:cNvGraphicFramePr>
-                  <a:graphicFrameLocks xmlns:a="http://schemas.openxmlformats.org/drawingml/2006/main"/>
-                </wp:cNvGraphicFramePr>
-                <a:graphic xmlns:a="http://schemas.openxmlformats.org/drawingml/2006/main">
-                  <a:graphicData uri="http://schemas.microsoft.com/office/word/2010/wordprocessingShape">
-                    <wps:wsp>
-                      <wps:cNvSpPr txBox="1">
-                        <a:spLocks noChangeArrowheads="1"/>
-                      </wps:cNvSpPr>
-                      <wps:spPr bwMode="auto">
-                        <a:xfrm>
-                          <a:off x="0" y="0"/>
-                          <a:ext cx="941070" cy="1404620"/>
-                        </a:xfrm>
-                        <a:prstGeom prst="rect">
-                          <a:avLst/>
-                        </a:prstGeom>
-                        <a:noFill/>
-                        <a:ln w="9525">
-                          <a:noFill/>
-                          <a:miter lim="800000"/>
-                          <a:headEnd/>
-                          <a:tailEnd/>
-                        </a:ln>
-                      </wps:spPr>
-                      <wps:txbx>
-                        <w:txbxContent>
-                          <w:p>
-                            <w:pPr>
-                              <w:rPr>
-                                <w:color w:val="FF0000"/>
-                              </w:rPr>
-                            </w:pPr>
-                            <w:r>
-                              <w:rPr>
-                                <w:color w:val="FF0000"/>
-                              </w:rPr>
-                              <w:t>Bank name</w:t>
-                            </w:r>
-                          </w:p>
-                        </w:txbxContent>
-                      </wps:txbx>
-                      <wps:bodyPr rot="0" vert="horz" wrap="square" lIns="91440" tIns="45720" rIns="91440" bIns="45720" anchor="t" anchorCtr="0">
-                        <a:spAutoFit/>
-                      </wps:bodyPr>
-                    </wps:wsp>
-                  </a:graphicData>
-                </a:graphic>
-                <wp14:sizeRelH relativeFrom="margin">
-                  <wp14:pctWidth>0</wp14:pctWidth>
-                </wp14:sizeRelH>
-                <wp14:sizeRelV relativeFrom="margin">
-                  <wp14:pctHeight>20000</wp14:pctHeight>
-                </wp14:sizeRelV>
-              </wp:anchor>
-            </w:drawing>
-          </mc:Choice>
-          <mc:Fallback>
-            <w:pict>
-              <v:shape id="_x0000_s1028" type="#_x0000_t202" style="position:absolute;margin-left:4in;margin-top:26.4pt;width:74.1pt;height:110.6pt;z-index:251661312;visibility:visible;mso-wrap-style:square;mso-width-percent:0;mso-height-percent:200;mso-wrap-distance-left:9pt;mso-wrap-distance-top:3.6pt;mso-wrap-distance-right:9pt;mso-wrap-distance-bottom:3.6pt;mso-position-horizontal:absolute;mso-position-horizontal-relative:text;mso-position-vertical:absolute;mso-position-vertical-relative:text;mso-width-percent:0;mso-height-percent:200;mso-width-relative:margin;mso-height-relative:margin;v-text-anchor:top" o:gfxdata="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" filled="f" stroked="f">
-                <v:textbox style="mso-fit-shape-to-text:t">
-                  <w:txbxContent>
-                    <w:p>
-                      <w:pPr>
-                        <w:rPr>
-                          <w:color w:val="FF0000"/>
-                        </w:rPr>
-                      </w:pPr>
-                      <w:r>
-                        <w:rPr>
-                          <w:color w:val="FF0000"/>
-                        </w:rPr>
-                        <w:t>Bank name</w:t>
-                      </w:r>
-                    </w:p>
-                  </w:txbxContent>
-                </v:textbox>
-              </v:shape>
-            </w:pict>
-          </mc:Fallback>
-        </mc:AlternateContent>
-      </w:r>
-      <w:r>
-        <w:rPr>
-          <w:noProof/>
-        </w:rPr>
-        <mc:AlternateContent>
-          <mc:Choice Requires="wps">
-            <w:drawing>
-              <wp:anchor distT="0" distB="0" distL="114300" distR="114300" simplePos="0" relativeHeight="251666432" behindDoc="0" locked="0" layoutInCell="1" allowOverlap="1">
-                <wp:simplePos x="0" y="0"/>
-                <wp:positionH relativeFrom="column">
-                  <wp:posOffset>2942204</wp:posOffset>
-                </wp:positionH>
-                <wp:positionV relativeFrom="paragraph">
-                  <wp:posOffset>820531</wp:posOffset>
-                </wp:positionV>
-                <wp:extent cx="177421" cy="6824"/>
-                <wp:effectExtent l="0" t="57150" r="32385" b="88900"/>
-                <wp:wrapNone/>
-                <wp:docPr id="10" name="Straight Arrow Connector 10"/>
-                <wp:cNvGraphicFramePr/>
-                <a:graphic xmlns:a="http://schemas.openxmlformats.org/drawingml/2006/main">
-                  <a:graphicData uri="http://schemas.microsoft.com/office/word/2010/wordprocessingShape">
-                    <wps:wsp>
-                      <wps:cNvCnPr/>
-                      <wps:spPr>
-                        <a:xfrm>
-                          <a:off x="0" y="0"/>
-                          <a:ext cx="177421" cy="6824"/>
-                        </a:xfrm>
-                        <a:prstGeom prst="straightConnector1">
-                          <a:avLst/>
-                        </a:prstGeom>
-                        <a:ln>
-                          <a:solidFill>
-                            <a:srgbClr val="FF0000"/>
-                          </a:solidFill>
-                          <a:tailEnd type="triangle"/>
-                        </a:ln>
-                      </wps:spPr>
-                      <wps:style>
-                        <a:lnRef idx="3">
-                          <a:schemeClr val="accent2"/>
-                        </a:lnRef>
-                        <a:fillRef idx="0">
-                          <a:schemeClr val="accent2"/>
-                        </a:fillRef>
-                        <a:effectRef idx="2">
-                          <a:schemeClr val="accent2"/>
-                        </a:effectRef>
-                        <a:fontRef idx="minor">
-                          <a:schemeClr val="tx1"/>
-                        </a:fontRef>
-                      </wps:style>
-                      <wps:bodyPr/>
-                    </wps:wsp>
-                  </a:graphicData>
-                </a:graphic>
-              </wp:anchor>
-            </w:drawing>
-          </mc:Choice>
-          <mc:Fallback>
-            <w:pict>
-              <v:shape w14:anchorId="659F1F97" id="Straight Arrow Connector 10" o:spid="_x0000_s1026" type="#_x0000_t32" style="position:absolute;margin-left:231.65pt;margin-top:64.6pt;width:13.95pt;height:.55pt;z-index:251666432;visibility:visible;mso-wrap-style:square;mso-wrap-distance-left:9pt;mso-wrap-distance-top:0;mso-wrap-distance-right:9pt;mso-wrap-distance-bottom:0;mso-position-horizontal:absolute;mso-position-horizontal-relative:text;mso-position-vertical:absolute;mso-position-vertical-relative:text" o:gfxdata="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" strokecolor="red" strokeweight="1.5pt">
+              <v:shape w14:anchorId="6580AC22" id="Straight Arrow Connector 11" o:spid="_x0000_s1026" type="#_x0000_t32" style="position:absolute;margin-left:280.4pt;margin-top:37.95pt;width:13.95pt;height:.5pt;z-index:251668480;visibility:visible;mso-wrap-style:square;mso-width-percent:0;mso-height-percent:0;mso-wrap-distance-left:9pt;mso-wrap-distance-top:0;mso-wrap-distance-right:9pt;mso-wrap-distance-bottom:0;mso-position-horizontal:absolute;mso-position-horizontal-relative:text;mso-position-vertical:absolute;mso-position-vertical-relative:text;mso-width-percent:0;mso-height-percent:0;mso-width-relative:margin;mso-height-relative:margin" o:gfxdata="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" strokecolor="red" strokeweight="1.5pt">
                 <v:stroke endarrow="block" joinstyle="miter"/>
               </v:shape>
             </w:pict>
@@ -4114,7 +4294,7 @@
           </mc:Choice>
           <mc:Fallback>
             <w:pict>
-              <v:rect w14:anchorId="2EB62D34" id="Rectangle 3" o:spid="_x0000_s1026" style="position:absolute;margin-left:0;margin-top:30.15pt;width:96.2pt;height:17.2pt;z-index:251659264;visibility:visible;mso-wrap-style:square;mso-wrap-distance-left:9pt;mso-wrap-distance-top:0;mso-wrap-distance-right:9pt;mso-wrap-distance-bottom:0;mso-position-horizontal:center;mso-position-horizontal-relative:margin;mso-position-vertical:absolute;mso-position-vertical-relative:text;v-text-anchor:middle" o:gfxdata="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" filled="f" strokecolor="red" strokeweight="1pt">
+              <v:rect w14:anchorId="6D1B7201" id="Rectangle 3" o:spid="_x0000_s1026" style="position:absolute;margin-left:0;margin-top:30.15pt;width:96.2pt;height:17.2pt;z-index:251659264;visibility:visible;mso-wrap-style:square;mso-wrap-distance-left:9pt;mso-wrap-distance-top:0;mso-wrap-distance-right:9pt;mso-wrap-distance-bottom:0;mso-position-horizontal:center;mso-position-horizontal-relative:margin;mso-position-vertical:absolute;mso-position-vertical-relative:text;v-text-anchor:middle" o:gfxdata="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" filled="f" strokecolor="red" strokeweight="1pt">
                 <w10:wrap anchorx="margin"/>
               </v:rect>
             </w:pict>
@@ -4123,111 +4303,19 @@
       </w:r>
       <w:r>
         <w:rPr>
-          <w:rFonts w:ascii="Times New Roman" w:eastAsia="Times New Roman" w:hAnsi="Times New Roman" w:cs="Times New Roman"/>
-          <w:b/>
-          <w:bCs/>
           <w:noProof/>
-          <w:sz w:val="36"/>
-          <w:szCs w:val="36"/>
-        </w:rPr>
-        <mc:AlternateContent>
-          <mc:Choice Requires="wps">
-            <w:drawing>
-              <wp:anchor distT="0" distB="0" distL="114300" distR="114300" simplePos="0" relativeHeight="251663360" behindDoc="0" locked="0" layoutInCell="1" allowOverlap="1" wp14:anchorId="0B7616E4" wp14:editId="4C58DE54">
-                <wp:simplePos x="0" y="0"/>
-                <wp:positionH relativeFrom="margin">
-                  <wp:posOffset>35173</wp:posOffset>
-                </wp:positionH>
-                <wp:positionV relativeFrom="paragraph">
-                  <wp:posOffset>646816</wp:posOffset>
-                </wp:positionV>
-                <wp:extent cx="2900149" cy="259090"/>
-                <wp:effectExtent l="0" t="0" r="14605" b="26670"/>
-                <wp:wrapNone/>
-                <wp:docPr id="4" name="Rectangle 4"/>
-                <wp:cNvGraphicFramePr/>
-                <a:graphic xmlns:a="http://schemas.openxmlformats.org/drawingml/2006/main">
-                  <a:graphicData uri="http://schemas.microsoft.com/office/word/2010/wordprocessingShape">
-                    <wps:wsp>
-                      <wps:cNvSpPr/>
-                      <wps:spPr>
-                        <a:xfrm>
-                          <a:off x="0" y="0"/>
-                          <a:ext cx="2900149" cy="259090"/>
-                        </a:xfrm>
-                        <a:prstGeom prst="rect">
-                          <a:avLst/>
-                        </a:prstGeom>
-                        <a:noFill/>
-                        <a:ln>
-                          <a:solidFill>
-                            <a:srgbClr val="FF0000"/>
-                          </a:solidFill>
-                        </a:ln>
-                      </wps:spPr>
-                      <wps:style>
-                        <a:lnRef idx="2">
-                          <a:schemeClr val="accent1">
-                            <a:shade val="50000"/>
-                          </a:schemeClr>
-                        </a:lnRef>
-                        <a:fillRef idx="1">
-                          <a:schemeClr val="accent1"/>
-                        </a:fillRef>
-                        <a:effectRef idx="0">
-                          <a:schemeClr val="accent1"/>
-                        </a:effectRef>
-                        <a:fontRef idx="minor">
-                          <a:schemeClr val="lt1"/>
-                        </a:fontRef>
-                      </wps:style>
-                      <wps:bodyPr rot="0" spcFirstLastPara="0" vertOverflow="overflow" horzOverflow="overflow" vert="horz" wrap="square" lIns="91440" tIns="45720" rIns="91440" bIns="45720" numCol="1" spcCol="0" rtlCol="0" fromWordArt="0" anchor="ctr" anchorCtr="0" forceAA="0" compatLnSpc="1">
-                        <a:prstTxWarp prst="textNoShape">
-                          <a:avLst/>
-                        </a:prstTxWarp>
-                        <a:noAutofit/>
-                      </wps:bodyPr>
-                    </wps:wsp>
-                  </a:graphicData>
-                </a:graphic>
-                <wp14:sizeRelH relativeFrom="margin">
-                  <wp14:pctWidth>0</wp14:pctWidth>
-                </wp14:sizeRelH>
-                <wp14:sizeRelV relativeFrom="margin">
-                  <wp14:pctHeight>0</wp14:pctHeight>
-                </wp14:sizeRelV>
-              </wp:anchor>
-            </w:drawing>
-          </mc:Choice>
-          <mc:Fallback>
-            <w:pict>
-              <v:rect w14:anchorId="4FBC7D57" id="Rectangle 4" o:spid="_x0000_s1026" style="position:absolute;margin-left:2.75pt;margin-top:50.95pt;width:228.35pt;height:20.4pt;z-index:251663360;visibility:visible;mso-wrap-style:square;mso-width-percent:0;mso-height-percent:0;mso-wrap-distance-left:9pt;mso-wrap-distance-top:0;mso-wrap-distance-right:9pt;mso-wrap-distance-bottom:0;mso-position-horizontal:absolute;mso-position-horizontal-relative:margin;mso-position-vertical:absolute;mso-position-vertical-relative:text;mso-width-percent:0;mso-height-percent:0;mso-width-relative:margin;mso-height-relative:margin;v-text-anchor:middle" o:gfxdata="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" filled="f" strokecolor="red" strokeweight="1pt">
-                <w10:wrap anchorx="margin"/>
-              </v:rect>
-            </w:pict>
-          </mc:Fallback>
-        </mc:AlternateContent>
+        </w:rPr>
+        <w:t xml:space="preserve"> </w:t>
       </w:r>
       <w:r>
         <w:rPr>
           <w:noProof/>
         </w:rPr>
-        <w:t xml:space="preserve"> </w:t>
-      </w:r>
-      <w:r>
-        <w:rPr>
-          <w:rFonts w:ascii="Times New Roman" w:eastAsia="Times New Roman" w:hAnsi="Times New Roman" w:cs="Times New Roman"/>
-          <w:b/>
-          <w:bCs/>
-          <w:noProof/>
-          <w:sz w:val="36"/>
-          <w:szCs w:val="36"/>
-        </w:rPr>
         <w:drawing>
-          <wp:inline distT="0" distB="0" distL="0" distR="0" wp14:anchorId="2CB2B5E7" wp14:editId="18132DCA">
-            <wp:extent cx="5943600" cy="3102610"/>
-            <wp:effectExtent l="0" t="0" r="0" b="2540"/>
-            <wp:docPr id="6" name="Picture 6"/>
+          <wp:inline distT="0" distB="0" distL="0" distR="0" wp14:anchorId="6B751977" wp14:editId="5FE4280F">
+            <wp:extent cx="5943600" cy="2825750"/>
+            <wp:effectExtent l="0" t="0" r="0" b="0"/>
+            <wp:docPr id="2" name="Picture 2"/>
             <wp:cNvGraphicFramePr>
               <a:graphicFrameLocks xmlns:a="http://schemas.openxmlformats.org/drawingml/2006/main" noChangeAspect="1"/>
             </wp:cNvGraphicFramePr>
@@ -4247,7 +4335,7 @@
                   <pic:spPr>
                     <a:xfrm>
                       <a:off x="0" y="0"/>
-                      <a:ext cx="5943600" cy="3102610"/>
+                      <a:ext cx="5943600" cy="2825750"/>
                     </a:xfrm>
                     <a:prstGeom prst="rect">
                       <a:avLst/>
@@ -4314,7 +4402,67 @@
           <w:sz w:val="24"/>
           <w:szCs w:val="24"/>
         </w:rPr>
-        <w:t>You can see the bank name you entered in the previous form, the controls for the screens as well a list of all available added screens and which screen is set as active.</w:t>
+        <w:t>You can see the bank name you entered in the previous form, the controls for the screens as well a list of all available added screens and which screen is set as active</w:t>
+      </w:r>
+      <w:r>
+        <w:rPr>
+          <w:rFonts w:ascii="Times New Roman" w:eastAsia="Times New Roman" w:hAnsi="Times New Roman" w:cs="Times New Roman"/>
+          <w:sz w:val="24"/>
+          <w:szCs w:val="24"/>
+        </w:rPr>
+        <w:t>.</w:t>
+      </w:r>
+    </w:p>
+    <w:p>
+      <w:pPr>
+        <w:pStyle w:val="ListParagraph"/>
+        <w:numPr>
+          <w:ilvl w:val="0"/>
+          <w:numId w:val="24"/>
+        </w:numPr>
+        <w:spacing w:before="100" w:beforeAutospacing="1" w:after="100" w:afterAutospacing="1" w:line="240" w:lineRule="auto"/>
+        <w:outlineLvl w:val="1"/>
+        <w:rPr>
+          <w:rFonts w:ascii="Times New Roman" w:eastAsia="Times New Roman" w:hAnsi="Times New Roman" w:cs="Times New Roman"/>
+          <w:b/>
+          <w:bCs/>
+          <w:sz w:val="36"/>
+          <w:szCs w:val="36"/>
+        </w:rPr>
+      </w:pPr>
+      <w:r>
+        <w:rPr>
+          <w:rFonts w:ascii="Times New Roman" w:eastAsia="Times New Roman" w:hAnsi="Times New Roman" w:cs="Times New Roman"/>
+          <w:sz w:val="24"/>
+          <w:szCs w:val="24"/>
+        </w:rPr>
+        <w:t>You can select one or more screens using the checkbox selection seen in the first column</w:t>
+      </w:r>
+    </w:p>
+    <w:p>
+      <w:pPr>
+        <w:pStyle w:val="ListParagraph"/>
+        <w:numPr>
+          <w:ilvl w:val="0"/>
+          <w:numId w:val="24"/>
+        </w:numPr>
+        <w:spacing w:before="100" w:beforeAutospacing="1" w:after="100" w:afterAutospacing="1" w:line="240" w:lineRule="auto"/>
+        <w:outlineLvl w:val="1"/>
+        <w:rPr>
+          <w:rFonts w:ascii="Times New Roman" w:eastAsia="Times New Roman" w:hAnsi="Times New Roman" w:cs="Times New Roman"/>
+          <w:b/>
+          <w:bCs/>
+          <w:sz w:val="36"/>
+          <w:szCs w:val="36"/>
+        </w:rPr>
+      </w:pPr>
+      <w:r>
+        <w:rPr>
+          <w:rFonts w:ascii="Times New Roman" w:eastAsia="Times New Roman" w:hAnsi="Times New Roman" w:cs="Times New Roman"/>
+          <w:sz w:val="24"/>
+          <w:szCs w:val="24"/>
+        </w:rPr>
+        <w:t>The right most control is for refreshing the screens incase another user has made changes to the screens.</w:t>
       </w:r>
     </w:p>
     <w:p>
@@ -4333,10 +4481,10 @@
           <w:szCs w:val="36"/>
         </w:rPr>
         <w:drawing>
-          <wp:inline distT="0" distB="0" distL="0" distR="0" wp14:anchorId="33EAE65A" wp14:editId="41BCD90F">
-            <wp:extent cx="5943600" cy="3141980"/>
-            <wp:effectExtent l="0" t="0" r="0" b="1270"/>
-            <wp:docPr id="7" name="Picture 7"/>
+          <wp:inline distT="0" distB="0" distL="0" distR="0" wp14:anchorId="4AE2D99E" wp14:editId="70B6879D">
+            <wp:extent cx="5943600" cy="2800985"/>
+            <wp:effectExtent l="0" t="0" r="0" b="0"/>
+            <wp:docPr id="9" name="Picture 9"/>
             <wp:cNvGraphicFramePr>
               <a:graphicFrameLocks xmlns:a="http://schemas.openxmlformats.org/drawingml/2006/main" noChangeAspect="1"/>
             </wp:cNvGraphicFramePr>
@@ -4356,7 +4504,7 @@
                   <pic:spPr>
                     <a:xfrm>
                       <a:off x="0" y="0"/>
-                      <a:ext cx="5943600" cy="3141980"/>
+                      <a:ext cx="5943600" cy="2800985"/>
                     </a:xfrm>
                     <a:prstGeom prst="rect">
                       <a:avLst/>
@@ -4423,7 +4571,15 @@
           <w:sz w:val="24"/>
           <w:szCs w:val="24"/>
         </w:rPr>
-        <w:t>Highlighting one of the available screens activates the edit and delete buttons.</w:t>
+        <w:t>Selecting</w:t>
+      </w:r>
+      <w:r>
+        <w:rPr>
+          <w:rFonts w:ascii="Times New Roman" w:eastAsia="Times New Roman" w:hAnsi="Times New Roman" w:cs="Times New Roman"/>
+          <w:sz w:val="24"/>
+          <w:szCs w:val="24"/>
+        </w:rPr>
+        <w:t xml:space="preserve"> one of the available screens activates the edit and delete buttons.</w:t>
       </w:r>
     </w:p>
     <w:p>
@@ -6538,27 +6694,14 @@
                       <w:r>
                         <w:t xml:space="preserve">Figure </w:t>
                       </w:r>
-                      <w:r>
-                        <w:fldChar w:fldCharType="begin"/>
-                      </w:r>
-                      <w:r>
-                        <w:instrText xml:space="preserve"> SEQ Figure \* ARABIC </w:instrText>
-                      </w:r>
-                      <w:r>
-                        <w:fldChar w:fldCharType="separate"/>
-                      </w:r>
-                      <w:r>
-                        <w:rPr>
-                          <w:noProof/>
-                        </w:rPr>
-                        <w:t>7</w:t>
-                      </w:r>
-                      <w:r>
-                        <w:rPr>
-                          <w:noProof/>
-                        </w:rPr>
-                        <w:fldChar w:fldCharType="end"/>
-                      </w:r>
+                      <w:fldSimple w:instr=" SEQ Figure \* ARABIC ">
+                        <w:r>
+                          <w:rPr>
+                            <w:noProof/>
+                          </w:rPr>
+                          <w:t>7</w:t>
+                        </w:r>
+                      </w:fldSimple>
                       <w:r>
                         <w:t xml:space="preserve"> Add Button / Issue Ticket</w:t>
                       </w:r>
@@ -6739,27 +6882,14 @@
                       <w:r>
                         <w:t xml:space="preserve">Figure </w:t>
                       </w:r>
-                      <w:r>
-                        <w:fldChar w:fldCharType="begin"/>
-                      </w:r>
-                      <w:r>
-                        <w:instrText xml:space="preserve"> SEQ Figure \* ARABIC </w:instrText>
-                      </w:r>
-                      <w:r>
-                        <w:fldChar w:fldCharType="separate"/>
-                      </w:r>
-                      <w:r>
-                        <w:rPr>
-                          <w:noProof/>
-                        </w:rPr>
-                        <w:t>8</w:t>
-                      </w:r>
-                      <w:r>
-                        <w:rPr>
-                          <w:noProof/>
-                        </w:rPr>
-                        <w:fldChar w:fldCharType="end"/>
-                      </w:r>
+                      <w:fldSimple w:instr=" SEQ Figure \* ARABIC ">
+                        <w:r>
+                          <w:rPr>
+                            <w:noProof/>
+                          </w:rPr>
+                          <w:t>8</w:t>
+                        </w:r>
+                      </w:fldSimple>
                       <w:r>
                         <w:t xml:space="preserve"> Add Button / Show Message</w:t>
                       </w:r>

</xml_diff>